<commit_message>
updates for 2026 pre propagation
</commit_message>
<xml_diff>
--- a/Resume-Bas.docx
+++ b/Resume-Bas.docx
@@ -21,27 +21,26 @@
           <w:sz w:val="20"/>
           <w:szCs w:val="20"/>
         </w:rPr>
-        <w:t>PROFESSIONAL SUMMARY: Software Designer / System Architect</w:t>
-      </w:r>
-      <w:r>
-        <w:rPr>
-          <w:rFonts w:ascii="Arial" w:eastAsia="Arial" w:hAnsi="Arial" w:cs="Arial"/>
-          <w:b/>
+        <w:t>PROFESSIONAL SUMMARY: Fractional CTO / Enterprise Architect / Software Architect / AI Tutor</w:t>
+      </w:r>
+    </w:p>
+    <w:p>
+      <w:pPr>
+        <w:rPr>
+          <w:rFonts w:ascii="Arial" w:eastAsia="Arial" w:hAnsi="Arial" w:cs="Arial"/>
           <w:color w:val="0E101A"/>
           <w:sz w:val="20"/>
           <w:szCs w:val="20"/>
         </w:rPr>
-        <w:t xml:space="preserve"> / </w:t>
-      </w:r>
-      <w:r>
-        <w:rPr>
-          <w:rFonts w:ascii="Arial" w:eastAsia="Arial" w:hAnsi="Arial" w:cs="Arial"/>
-          <w:b/>
+      </w:pPr>
+      <w:r>
+        <w:rPr>
+          <w:rFonts w:ascii="Arial" w:eastAsia="Arial" w:hAnsi="Arial" w:cs="Arial"/>
           <w:color w:val="0E101A"/>
           <w:sz w:val="20"/>
           <w:szCs w:val="20"/>
         </w:rPr>
-        <w:t>Enterprise Architect</w:t>
+        <w:t>With 20+ years as a full-stack software engineer, I have cultivated my reputation as a highly productive technical leader, keen to collaborate, mentor, navigate problems, and innovate useful solutions, particularly when it comes to bridging the needs of technology and business. By recognizing where automation is valuable and supporting businesses in understanding what cannot be automated, I help make strategic gains that improve processes for both humans and software. Some of my strengths are aligning technology to business goals, while fostering meaningful connections between business stakeholders, engineering leaders, and their teams, both taking and guiding decisions.</w:t>
       </w:r>
     </w:p>
     <w:p>
@@ -53,15 +52,16 @@
           <w:szCs w:val="20"/>
         </w:rPr>
       </w:pPr>
-      <w:r>
+    </w:p>
+    <w:p>
+      <w:pPr>
         <w:rPr>
           <w:rFonts w:ascii="Arial" w:eastAsia="Arial" w:hAnsi="Arial" w:cs="Arial"/>
           <w:color w:val="0E101A"/>
           <w:sz w:val="20"/>
           <w:szCs w:val="20"/>
         </w:rPr>
-        <w:t xml:space="preserve">With 20+ years as a full-stack software engineer, I have cultivated my reputation as a highly productive technical leader, keen to collaborate, mentor, navigate problems, and innovate useful solutions, particularly when it comes to bridging the needs of technology and business. By recognizing where automation is valuable and supporting businesses in understanding what cannot be automated, I help make strategic gains that improve processes for both humans and software. </w:t>
-      </w:r>
+      </w:pPr>
       <w:r>
         <w:rPr>
           <w:rFonts w:ascii="Arial" w:eastAsia="Arial" w:hAnsi="Arial" w:cs="Arial"/>
@@ -69,17 +69,18 @@
           <w:sz w:val="20"/>
           <w:szCs w:val="20"/>
         </w:rPr>
-        <w:t>Some of my strengths are</w:t>
-      </w:r>
-      <w:r>
+        <w:t>These insights have allowed me to effectively communicate, support, coach, and build solutions with and for cross-functional product delivery teams. Leveraging my technical acumen, skills, and knowledge beyond domain-specific expertise, I have successfully navigated a wide range of challenges, including massive volume, high concurrency, internal systems, B2B platforms, and consumer-facing applications. My experience spans configurations from monoliths to microservices, and projects ranging from greenfield development to modernizing decades-old systems. My curiosity and strategic mindset provide a broad perspective, enabling me to uncover meaningful contributions even in less glamorous but critical areas like software quality, where impactful improvements often lie.</w:t>
+      </w:r>
+    </w:p>
+    <w:p>
+      <w:pPr>
         <w:rPr>
           <w:rFonts w:ascii="Arial" w:eastAsia="Arial" w:hAnsi="Arial" w:cs="Arial"/>
           <w:color w:val="0E101A"/>
           <w:sz w:val="20"/>
           <w:szCs w:val="20"/>
         </w:rPr>
-        <w:t xml:space="preserve"> aligning technology to business goals, while fostering meaningful connections between business stakeholders, engineering leaders, and their teams, both taking and guiding decisions.</w:t>
-      </w:r>
+      </w:pPr>
     </w:p>
     <w:p>
       <w:pPr>
@@ -90,16 +91,15 @@
           <w:szCs w:val="20"/>
         </w:rPr>
       </w:pPr>
-    </w:p>
-    <w:p>
-      <w:pPr>
+      <w:r>
         <w:rPr>
           <w:rFonts w:ascii="Arial" w:eastAsia="Arial" w:hAnsi="Arial" w:cs="Arial"/>
           <w:color w:val="0E101A"/>
           <w:sz w:val="20"/>
           <w:szCs w:val="20"/>
         </w:rPr>
-      </w:pPr>
+        <w:t>I am practical and current on AI. Through Systems Sense Advisory I ship prototype MVPs in 8</w:t>
+      </w:r>
       <w:r>
         <w:rPr>
           <w:rFonts w:ascii="Arial" w:eastAsia="Arial" w:hAnsi="Arial" w:cs="Arial"/>
@@ -107,34 +107,26 @@
           <w:sz w:val="20"/>
           <w:szCs w:val="20"/>
         </w:rPr>
-        <w:t>These insights have allowed me to effectively communicate, support, coach, and build solutions with and for cross-functional product delivery teams. Leveraging my technical acumen, skills, and knowledge beyond domain-specific expertise, I have successfully navigated a wide range of challenges, including massive volume, high concurrency, internal systems, B2B platforms, and consumer-facing applications. My experience spans configurations from monoliths to microservices, and projects ranging from greenfield development to modernizing decades-old systems. My curiosity and strategic mindset provide a broad perspective, enabling me to uncover meaningful contributions even in less glamorous but critical areas like software quality, where impactful improvements often lie.</w:t>
-      </w:r>
-    </w:p>
-    <w:p>
-      <w:pPr>
+        <w:t xml:space="preserve"> -</w:t>
+      </w:r>
+      <w:r>
         <w:rPr>
           <w:rFonts w:ascii="Arial" w:eastAsia="Arial" w:hAnsi="Arial" w:cs="Arial"/>
           <w:color w:val="0E101A"/>
           <w:sz w:val="20"/>
           <w:szCs w:val="20"/>
         </w:rPr>
-      </w:pPr>
-    </w:p>
-    <w:p>
-      <w:pPr>
-        <w:pBdr>
-          <w:top w:val="nil"/>
-          <w:left w:val="nil"/>
-          <w:right w:val="nil"/>
-          <w:between w:val="nil"/>
-        </w:pBdr>
+        <w:t xml:space="preserve">12 weeks and harden them into production-ready systems, help teams adopt AI-powered software development, provide fractional CTO judgment (Advisor and Working CTO), and run hands-on AI mentoring for engineers and small teams. I run Possum Labs / Systems Sense Advisory as Software Architect and DGA, converting the American Possum Labs LLC into the Dutch Systems Sense Advisory BV as I relocate to the Netherlands in </w:t>
+      </w:r>
+      <w:r>
         <w:rPr>
           <w:rFonts w:ascii="Arial" w:eastAsia="Arial" w:hAnsi="Arial" w:cs="Arial"/>
           <w:color w:val="0E101A"/>
           <w:sz w:val="20"/>
           <w:szCs w:val="20"/>
         </w:rPr>
-      </w:pPr>
+        <w:t>October</w:t>
+      </w:r>
       <w:r>
         <w:rPr>
           <w:rFonts w:ascii="Arial" w:eastAsia="Arial" w:hAnsi="Arial" w:cs="Arial"/>
@@ -142,17 +134,11 @@
           <w:sz w:val="20"/>
           <w:szCs w:val="20"/>
         </w:rPr>
-        <w:t>Although my day-to-day activities rarely involve writing software, I still enjoy doing so, and since January 2024, I have been working on a hobby project up to 10 hours a week to develop a video game using Godot and C#. It has allowed me to leverage and expand my technical skills in areas like UX. I also use contract labor for specialized services and have worked with about 15 people in 10 countries. Although technically a commercial venture, it is not intended to be a viable business; my motivation is to show my daughter what I do.</w:t>
-      </w:r>
-    </w:p>
-    <w:p>
-      <w:pPr>
-        <w:pBdr>
-          <w:top w:val="nil"/>
-          <w:left w:val="nil"/>
-          <w:right w:val="nil"/>
-          <w:between w:val="nil"/>
-        </w:pBdr>
+        <w:t xml:space="preserve"> 2026.</w:t>
+      </w:r>
+    </w:p>
+    <w:p>
+      <w:pPr>
         <w:rPr>
           <w:rFonts w:ascii="Arial" w:eastAsia="Arial" w:hAnsi="Arial" w:cs="Arial"/>
           <w:color w:val="0E101A"/>
@@ -163,12 +149,6 @@
     </w:p>
     <w:p>
       <w:pPr>
-        <w:pBdr>
-          <w:top w:val="nil"/>
-          <w:left w:val="nil"/>
-          <w:right w:val="nil"/>
-          <w:between w:val="nil"/>
-        </w:pBdr>
         <w:rPr>
           <w:rFonts w:ascii="Arial" w:eastAsia="Arial" w:hAnsi="Arial" w:cs="Arial"/>
           <w:color w:val="0E101A"/>
@@ -183,18 +163,26 @@
           <w:sz w:val="20"/>
           <w:szCs w:val="20"/>
         </w:rPr>
-        <w:t>I’m looking for a technical leadership role at a focused organization.</w:t>
-      </w:r>
-    </w:p>
-    <w:p>
-      <w:pPr>
+        <w:t xml:space="preserve">The technologies I'm most familiar with for each family are C#, Angular, SQL Server, Mongo, Docker, Azure &amp; Kafka. I've utilized alternatives to all </w:t>
+      </w:r>
+      <w:r>
         <w:rPr>
           <w:rFonts w:ascii="Arial" w:eastAsia="Arial" w:hAnsi="Arial" w:cs="Arial"/>
           <w:color w:val="0E101A"/>
           <w:sz w:val="20"/>
           <w:szCs w:val="20"/>
         </w:rPr>
-      </w:pPr>
+        <w:t xml:space="preserve">of </w:t>
+      </w:r>
+      <w:r>
+        <w:rPr>
+          <w:rFonts w:ascii="Arial" w:eastAsia="Arial" w:hAnsi="Arial" w:cs="Arial"/>
+          <w:color w:val="0E101A"/>
+          <w:sz w:val="20"/>
+          <w:szCs w:val="20"/>
+        </w:rPr>
+        <w:t>these, and I do not believe this stack suits most applications.</w:t>
+      </w:r>
     </w:p>
     <w:p>
       <w:pPr>
@@ -207,15 +195,6 @@
           <w:szCs w:val="20"/>
         </w:rPr>
       </w:pPr>
-      <w:r>
-        <w:rPr>
-          <w:rFonts w:ascii="Arial" w:eastAsia="Arial" w:hAnsi="Arial" w:cs="Arial"/>
-          <w:color w:val="0E101A"/>
-          <w:sz w:val="20"/>
-          <w:szCs w:val="20"/>
-        </w:rPr>
-        <w:t>The technologies I’m most familiar with for each family are C#, Angular, SQL Server, Mongo, Docker, Azure &amp; Kafka. I’ve utilized alternatives to all these, and I do not believe this stack suits most applications.</w:t>
-      </w:r>
     </w:p>
     <w:p>
       <w:pPr>
@@ -228,9 +207,7 @@
           <w:szCs w:val="20"/>
         </w:rPr>
       </w:pPr>
-    </w:p>
-    <w:p>
-      <w:pPr>
+      <w:r>
         <w:rPr>
           <w:rFonts w:ascii="Arial" w:eastAsia="Arial" w:hAnsi="Arial" w:cs="Arial"/>
           <w:b/>
@@ -239,7 +216,8 @@
           <w:sz w:val="20"/>
           <w:szCs w:val="20"/>
         </w:rPr>
-      </w:pPr>
+        <w:t>It makes me happy to solve problems, build teams</w:t>
+      </w:r>
       <w:r>
         <w:rPr>
           <w:rFonts w:ascii="Arial" w:eastAsia="Arial" w:hAnsi="Arial" w:cs="Arial"/>
@@ -249,7 +227,7 @@
           <w:sz w:val="20"/>
           <w:szCs w:val="20"/>
         </w:rPr>
-        <w:t>It makes me happy to solve problems, build teams</w:t>
+        <w:t>,</w:t>
       </w:r>
       <w:r>
         <w:rPr>
@@ -260,7 +238,7 @@
           <w:sz w:val="20"/>
           <w:szCs w:val="20"/>
         </w:rPr>
-        <w:t>,</w:t>
+        <w:t xml:space="preserve"> and </w:t>
       </w:r>
       <w:r>
         <w:rPr>
@@ -271,7 +249,7 @@
           <w:sz w:val="20"/>
           <w:szCs w:val="20"/>
         </w:rPr>
-        <w:t xml:space="preserve"> and </w:t>
+        <w:t>help bridge the gap between business</w:t>
       </w:r>
       <w:r>
         <w:rPr>
@@ -282,7 +260,7 @@
           <w:sz w:val="20"/>
           <w:szCs w:val="20"/>
         </w:rPr>
-        <w:t>help bridge the gap between business</w:t>
+        <w:t>es</w:t>
       </w:r>
       <w:r>
         <w:rPr>
@@ -293,7 +271,7 @@
           <w:sz w:val="20"/>
           <w:szCs w:val="20"/>
         </w:rPr>
-        <w:t>es</w:t>
+        <w:t xml:space="preserve"> and</w:t>
       </w:r>
       <w:r>
         <w:rPr>
@@ -304,7 +282,7 @@
           <w:sz w:val="20"/>
           <w:szCs w:val="20"/>
         </w:rPr>
-        <w:t xml:space="preserve"> and</w:t>
+        <w:t xml:space="preserve"> </w:t>
       </w:r>
       <w:r>
         <w:rPr>
@@ -315,7 +293,7 @@
           <w:sz w:val="20"/>
           <w:szCs w:val="20"/>
         </w:rPr>
-        <w:t xml:space="preserve"> </w:t>
+        <w:t>software development</w:t>
       </w:r>
       <w:r>
         <w:rPr>
@@ -326,277 +304,23 @@
           <w:sz w:val="20"/>
           <w:szCs w:val="20"/>
         </w:rPr>
-        <w:t>software development</w:t>
-      </w:r>
-      <w:r>
-        <w:rPr>
-          <w:rFonts w:ascii="Arial" w:eastAsia="Arial" w:hAnsi="Arial" w:cs="Arial"/>
-          <w:b/>
-          <w:i/>
-          <w:color w:val="0E101A"/>
-          <w:sz w:val="20"/>
-          <w:szCs w:val="20"/>
-        </w:rPr>
         <w:t>.</w:t>
       </w:r>
     </w:p>
     <w:p>
       <w:pPr>
-        <w:rPr>
-          <w:rFonts w:ascii="Arial" w:eastAsia="Arial" w:hAnsi="Arial" w:cs="Arial"/>
-          <w:b/>
-          <w:i/>
-          <w:color w:val="0E101A"/>
-          <w:sz w:val="20"/>
-          <w:szCs w:val="20"/>
-        </w:rPr>
-      </w:pPr>
-    </w:p>
-    <w:p>
-      <w:pPr>
-        <w:pBdr>
-          <w:top w:val="nil"/>
-          <w:left w:val="nil"/>
-          <w:right w:val="nil"/>
-          <w:between w:val="nil"/>
-        </w:pBdr>
-        <w:rPr>
-          <w:rFonts w:ascii="Arial" w:eastAsia="Arial" w:hAnsi="Arial" w:cs="Arial"/>
-          <w:b/>
-          <w:bCs/>
-          <w:sz w:val="18"/>
-          <w:szCs w:val="18"/>
-        </w:rPr>
-      </w:pPr>
-      <w:r>
-        <w:rPr>
-          <w:rFonts w:ascii="Arial" w:eastAsia="Arial" w:hAnsi="Arial" w:cs="Arial"/>
-          <w:b/>
-          <w:bCs/>
-          <w:color w:val="0E101A"/>
-          <w:sz w:val="20"/>
-          <w:szCs w:val="20"/>
-        </w:rPr>
-        <w:t>This is a technology-focused resume; for a resume written for business people</w:t>
-      </w:r>
-      <w:r>
-        <w:rPr>
-          <w:rFonts w:ascii="Arial" w:eastAsia="Arial" w:hAnsi="Arial" w:cs="Arial"/>
-          <w:b/>
-          <w:bCs/>
-          <w:color w:val="0E101A"/>
-          <w:sz w:val="20"/>
-          <w:szCs w:val="20"/>
-        </w:rPr>
-        <w:t xml:space="preserve"> </w:t>
-      </w:r>
-      <w:hyperlink r:id="rId9" w:history="1">
-        <w:r>
-          <w:rPr>
-            <w:rStyle w:val="Hyperlink"/>
-            <w:rFonts w:ascii="Arial" w:eastAsia="Arial" w:hAnsi="Arial" w:cs="Arial"/>
-            <w:b/>
-            <w:bCs/>
-            <w:sz w:val="18"/>
-            <w:szCs w:val="18"/>
-          </w:rPr>
-          <w:t>https://github.com/BasHamer/Interview-Resources/blob/master/Resume-Bas-LeadershipFocused.pdf</w:t>
-        </w:r>
-      </w:hyperlink>
-      <w:r>
-        <w:rPr>
-          <w:rFonts w:ascii="Arial" w:eastAsia="Arial" w:hAnsi="Arial" w:cs="Arial"/>
-          <w:b/>
-          <w:bCs/>
-          <w:sz w:val="18"/>
-          <w:szCs w:val="18"/>
-        </w:rPr>
-        <w:t xml:space="preserve"> </w:t>
-      </w:r>
-    </w:p>
-    <w:p>
-      <w:pPr>
-        <w:pBdr>
-          <w:top w:val="nil"/>
-          <w:left w:val="nil"/>
-          <w:right w:val="nil"/>
-          <w:between w:val="nil"/>
-        </w:pBdr>
-        <w:rPr>
-          <w:rFonts w:ascii="Arial" w:eastAsia="Arial" w:hAnsi="Arial" w:cs="Arial"/>
-          <w:b/>
-          <w:bCs/>
-          <w:sz w:val="18"/>
-          <w:szCs w:val="18"/>
-        </w:rPr>
-      </w:pPr>
-    </w:p>
-    <w:p>
-      <w:pPr>
-        <w:pBdr>
-          <w:top w:val="nil"/>
-          <w:left w:val="nil"/>
-          <w:right w:val="nil"/>
-          <w:between w:val="nil"/>
-        </w:pBdr>
-        <w:rPr>
-          <w:rFonts w:ascii="Arial" w:eastAsia="Arial" w:hAnsi="Arial" w:cs="Arial"/>
-          <w:b/>
-          <w:bCs/>
-          <w:color w:val="0E101A"/>
-          <w:sz w:val="20"/>
-          <w:szCs w:val="20"/>
-          <w:lang w:val="nl-NL"/>
-        </w:rPr>
-      </w:pPr>
-      <w:r>
-        <w:rPr>
-          <w:rFonts w:ascii="Arial" w:eastAsia="Arial" w:hAnsi="Arial" w:cs="Arial"/>
-          <w:b/>
-          <w:bCs/>
-          <w:color w:val="0E101A"/>
-          <w:sz w:val="20"/>
-          <w:szCs w:val="20"/>
-          <w:lang w:val="nl-NL"/>
-        </w:rPr>
-        <w:t xml:space="preserve">Voor een </w:t>
-      </w:r>
-      <w:r>
-        <w:rPr>
-          <w:rFonts w:ascii="Arial" w:eastAsia="Arial" w:hAnsi="Arial" w:cs="Arial"/>
-          <w:b/>
-          <w:bCs/>
-          <w:color w:val="0E101A"/>
-          <w:sz w:val="20"/>
-          <w:szCs w:val="20"/>
-          <w:lang w:val="nl-NL"/>
-        </w:rPr>
-        <w:t>Nederlandse</w:t>
-      </w:r>
-      <w:r>
-        <w:rPr>
-          <w:rFonts w:ascii="Arial" w:eastAsia="Arial" w:hAnsi="Arial" w:cs="Arial"/>
-          <w:b/>
-          <w:bCs/>
-          <w:color w:val="0E101A"/>
-          <w:sz w:val="20"/>
-          <w:szCs w:val="20"/>
-          <w:lang w:val="nl-NL"/>
-        </w:rPr>
-        <w:t xml:space="preserve"> versie van dit cv, zie </w:t>
-      </w:r>
-    </w:p>
-    <w:p>
-      <w:pPr>
-        <w:pBdr>
-          <w:top w:val="nil"/>
-          <w:left w:val="nil"/>
-          <w:right w:val="nil"/>
-          <w:between w:val="nil"/>
-        </w:pBdr>
-        <w:rPr>
-          <w:rStyle w:val="Hyperlink"/>
-          <w:rFonts w:ascii="Arial" w:eastAsia="Arial" w:hAnsi="Arial" w:cs="Arial"/>
-          <w:b/>
-          <w:bCs/>
-          <w:sz w:val="20"/>
-          <w:szCs w:val="20"/>
-          <w:lang w:val="nl-NL"/>
-        </w:rPr>
-      </w:pPr>
-      <w:r>
-        <w:rPr>
-          <w:rFonts w:ascii="Arial" w:eastAsia="Arial" w:hAnsi="Arial" w:cs="Arial"/>
-          <w:b/>
-          <w:bCs/>
-          <w:sz w:val="20"/>
-          <w:szCs w:val="20"/>
-          <w:lang w:val="nl-NL"/>
-        </w:rPr>
-        <w:fldChar w:fldCharType="begin"/>
-      </w:r>
-      <w:r>
-        <w:rPr>
-          <w:rFonts w:ascii="Arial" w:eastAsia="Arial" w:hAnsi="Arial" w:cs="Arial"/>
-          <w:b/>
-          <w:bCs/>
-          <w:sz w:val="20"/>
-          <w:szCs w:val="20"/>
-          <w:lang w:val="nl-NL"/>
-        </w:rPr>
-        <w:instrText>HYPERLINK "https://github.com/BasHamer/Interview-Resources/blob/master/CV-Bas-NL.pdf"</w:instrText>
-      </w:r>
-      <w:r>
-        <w:rPr>
-          <w:rFonts w:ascii="Arial" w:eastAsia="Arial" w:hAnsi="Arial" w:cs="Arial"/>
-          <w:b/>
-          <w:bCs/>
-          <w:sz w:val="20"/>
-          <w:szCs w:val="20"/>
-          <w:lang w:val="nl-NL"/>
-        </w:rPr>
-      </w:r>
-      <w:r>
-        <w:rPr>
-          <w:rFonts w:ascii="Arial" w:eastAsia="Arial" w:hAnsi="Arial" w:cs="Arial"/>
-          <w:b/>
-          <w:bCs/>
-          <w:sz w:val="20"/>
-          <w:szCs w:val="20"/>
-          <w:lang w:val="nl-NL"/>
-        </w:rPr>
-        <w:fldChar w:fldCharType="separate"/>
-      </w:r>
-      <w:r>
-        <w:rPr>
-          <w:rStyle w:val="Hyperlink"/>
-          <w:rFonts w:ascii="Arial" w:eastAsia="Arial" w:hAnsi="Arial" w:cs="Arial"/>
-          <w:b/>
-          <w:bCs/>
-          <w:sz w:val="20"/>
-          <w:szCs w:val="20"/>
-          <w:lang w:val="nl-NL"/>
-        </w:rPr>
-        <w:t>https://github.com/BasHamer/Interview-Resources/blob/master/CV-Bas-NL.pdf</w:t>
-      </w:r>
-      <w:r>
-        <w:rPr>
-          <w:rStyle w:val="Hyperlink"/>
-          <w:rFonts w:ascii="Arial" w:eastAsia="Arial" w:hAnsi="Arial" w:cs="Arial"/>
-          <w:b/>
-          <w:bCs/>
-          <w:sz w:val="20"/>
-          <w:szCs w:val="20"/>
-          <w:lang w:val="nl-NL"/>
-        </w:rPr>
-        <w:br/>
-      </w:r>
-    </w:p>
-    <w:p>
-      <w:pPr>
-        <w:pBdr>
-          <w:top w:val="nil"/>
-          <w:left w:val="nil"/>
-          <w:right w:val="nil"/>
-          <w:between w:val="nil"/>
-        </w:pBdr>
-        <w:rPr>
-          <w:rFonts w:ascii="Arial" w:eastAsia="Arial" w:hAnsi="Arial" w:cs="Arial"/>
-          <w:sz w:val="20"/>
-          <w:szCs w:val="20"/>
-        </w:rPr>
-      </w:pPr>
-      <w:r>
-        <w:rPr>
-          <w:rFonts w:ascii="Arial" w:eastAsia="Arial" w:hAnsi="Arial" w:cs="Arial"/>
-          <w:b/>
-          <w:bCs/>
-          <w:sz w:val="20"/>
-          <w:szCs w:val="20"/>
-          <w:lang w:val="nl-NL"/>
-        </w:rPr>
-        <w:fldChar w:fldCharType="end"/>
-      </w:r>
+        <w:pBdr>
+          <w:top w:val="nil"/>
+          <w:left w:val="nil"/>
+          <w:right w:val="nil"/>
+          <w:between w:val="nil"/>
+        </w:pBdr>
+        <w:rPr>
+          <w:rFonts w:ascii="Arial" w:eastAsia="Arial" w:hAnsi="Arial" w:cs="Arial"/>
+          <w:sz w:val="20"/>
+          <w:szCs w:val="20"/>
+        </w:rPr>
+      </w:pPr>
       <w:r>
         <w:rPr>
           <w:rFonts w:ascii="Arial" w:eastAsia="Arial" w:hAnsi="Arial" w:cs="Arial"/>
@@ -665,83 +389,76 @@
         </w:tabs>
         <w:rPr>
           <w:rFonts w:ascii="Arial" w:eastAsia="Arial" w:hAnsi="Arial" w:cs="Arial"/>
-          <w:color w:val="000000"/>
-          <w:sz w:val="20"/>
-          <w:szCs w:val="20"/>
-          <w:highlight w:val="white"/>
-        </w:rPr>
-      </w:pPr>
-      <w:r>
-        <w:rPr>
-          <w:rFonts w:ascii="Arial" w:eastAsia="Arial" w:hAnsi="Arial" w:cs="Arial"/>
-          <w:b/>
-          <w:sz w:val="20"/>
-          <w:szCs w:val="20"/>
-        </w:rPr>
-        <w:t>Enterprise</w:t>
-      </w:r>
-      <w:r>
-        <w:rPr>
-          <w:rFonts w:ascii="Arial" w:eastAsia="Arial" w:hAnsi="Arial" w:cs="Arial"/>
-          <w:b/>
-          <w:sz w:val="20"/>
-          <w:szCs w:val="20"/>
-        </w:rPr>
-        <w:t xml:space="preserve"> Architect</w:t>
-      </w:r>
-      <w:r>
-        <w:rPr>
-          <w:rFonts w:ascii="Arial" w:eastAsia="Arial" w:hAnsi="Arial" w:cs="Arial"/>
-          <w:b/>
-          <w:sz w:val="20"/>
-          <w:szCs w:val="20"/>
-        </w:rPr>
-        <w:t xml:space="preserve"> | </w:t>
-      </w:r>
-      <w:r>
-        <w:rPr>
-          <w:rFonts w:ascii="Arial" w:eastAsia="Arial" w:hAnsi="Arial" w:cs="Arial"/>
-          <w:b/>
-          <w:sz w:val="20"/>
-          <w:szCs w:val="20"/>
-        </w:rPr>
-        <w:t xml:space="preserve">Beeline - </w:t>
-      </w:r>
-      <w:r>
-        <w:rPr>
-          <w:rFonts w:ascii="Arial" w:eastAsia="Arial" w:hAnsi="Arial" w:cs="Arial"/>
-          <w:b/>
-          <w:sz w:val="20"/>
-          <w:szCs w:val="20"/>
-        </w:rPr>
-        <w:t xml:space="preserve">MBO </w:t>
-      </w:r>
-      <w:r>
-        <w:rPr>
-          <w:rFonts w:ascii="Arial" w:eastAsia="Arial" w:hAnsi="Arial" w:cs="Arial"/>
-          <w:b/>
-          <w:sz w:val="20"/>
-          <w:szCs w:val="20"/>
-        </w:rPr>
-        <w:t>Partners</w:t>
-      </w:r>
-      <w:r>
-        <w:rPr>
-          <w:rFonts w:ascii="Arial" w:eastAsia="Arial" w:hAnsi="Arial" w:cs="Arial"/>
-          <w:b/>
-          <w:sz w:val="20"/>
-          <w:szCs w:val="20"/>
-        </w:rPr>
-        <w:t xml:space="preserve"> | </w:t>
-      </w:r>
-      <w:r>
-        <w:rPr>
-          <w:rFonts w:ascii="Arial" w:eastAsia="Arial" w:hAnsi="Arial" w:cs="Arial"/>
-          <w:b/>
-          <w:sz w:val="20"/>
-          <w:szCs w:val="20"/>
-        </w:rPr>
-        <w:t>Remote</w:t>
+          <w:b/>
+          <w:bCs/>
+          <w:sz w:val="20"/>
+          <w:szCs w:val="20"/>
+        </w:rPr>
+      </w:pPr>
+      <w:r>
+        <w:rPr>
+          <w:rFonts w:ascii="Arial" w:eastAsia="Arial" w:hAnsi="Arial" w:cs="Arial"/>
+          <w:b/>
+          <w:sz w:val="20"/>
+          <w:szCs w:val="20"/>
+        </w:rPr>
+        <w:t>Software Architect / Fractional CTO</w:t>
+      </w:r>
+      <w:r>
+        <w:rPr>
+          <w:rFonts w:ascii="Arial" w:eastAsia="Arial" w:hAnsi="Arial" w:cs="Arial"/>
+          <w:b/>
+          <w:sz w:val="20"/>
+          <w:szCs w:val="20"/>
+        </w:rPr>
+        <w:t xml:space="preserve"> </w:t>
+      </w:r>
+      <w:r>
+        <w:rPr>
+          <w:rFonts w:ascii="Arial" w:eastAsia="Arial" w:hAnsi="Arial" w:cs="Arial"/>
+          <w:b/>
+          <w:sz w:val="20"/>
+          <w:szCs w:val="20"/>
+        </w:rPr>
+        <w:t xml:space="preserve">| </w:t>
+      </w:r>
+      <w:r>
+        <w:rPr>
+          <w:rFonts w:ascii="Arial" w:eastAsia="Arial" w:hAnsi="Arial" w:cs="Arial"/>
+          <w:b/>
+          <w:bCs/>
+          <w:sz w:val="20"/>
+          <w:szCs w:val="20"/>
+        </w:rPr>
+        <w:t>Systems Sense Advisory</w:t>
+      </w:r>
+      <w:r>
+        <w:rPr>
+          <w:rFonts w:ascii="Arial" w:eastAsia="Arial" w:hAnsi="Arial" w:cs="Arial"/>
+          <w:b/>
+          <w:bCs/>
+          <w:sz w:val="20"/>
+          <w:szCs w:val="20"/>
+        </w:rPr>
+        <w:t xml:space="preserve"> </w:t>
+      </w:r>
+      <w:r>
+        <w:rPr>
+          <w:rFonts w:ascii="Arial" w:eastAsia="Arial" w:hAnsi="Arial" w:cs="Arial"/>
+          <w:b/>
+          <w:sz w:val="20"/>
+          <w:szCs w:val="20"/>
+        </w:rPr>
+        <w:t xml:space="preserve">| </w:t>
+      </w:r>
+      <w:r>
+        <w:rPr>
+          <w:rFonts w:ascii="Arial" w:eastAsia="Arial" w:hAnsi="Arial" w:cs="Arial"/>
+          <w:b/>
+          <w:sz w:val="20"/>
+          <w:szCs w:val="20"/>
+        </w:rPr>
+        <w:t>Denver, CO</w:t>
       </w:r>
       <w:r>
         <w:rPr>
@@ -752,24 +469,17 @@
         </w:rPr>
         <w:tab/>
       </w:r>
-      <w:r>
-        <w:rPr>
-          <w:rFonts w:ascii="Arial" w:eastAsia="Arial" w:hAnsi="Arial" w:cs="Arial"/>
-          <w:b/>
-          <w:sz w:val="20"/>
-          <w:szCs w:val="20"/>
-        </w:rPr>
-        <w:t>Jan</w:t>
-      </w:r>
-      <w:r>
-        <w:rPr>
-          <w:rFonts w:ascii="Arial" w:eastAsia="Arial" w:hAnsi="Arial" w:cs="Arial"/>
-          <w:b/>
-          <w:sz w:val="20"/>
-          <w:szCs w:val="20"/>
-        </w:rPr>
-        <w:t xml:space="preserve"> 2022</w:t>
-      </w:r>
+      <w:proofErr w:type="gramStart"/>
+      <w:r>
+        <w:rPr>
+          <w:rFonts w:ascii="Arial" w:eastAsia="Arial" w:hAnsi="Arial" w:cs="Arial"/>
+          <w:b/>
+          <w:sz w:val="20"/>
+          <w:szCs w:val="20"/>
+        </w:rPr>
+        <w:t>Dec  2025</w:t>
+      </w:r>
+      <w:proofErr w:type="gramEnd"/>
       <w:r>
         <w:rPr>
           <w:rFonts w:ascii="Arial" w:eastAsia="Arial" w:hAnsi="Arial" w:cs="Arial"/>
@@ -787,16 +497,7 @@
           <w:sz w:val="20"/>
           <w:szCs w:val="20"/>
         </w:rPr>
-        <w:t>c</w:t>
-      </w:r>
-      <w:r>
-        <w:rPr>
-          <w:rFonts w:ascii="Arial" w:eastAsia="Arial" w:hAnsi="Arial" w:cs="Arial"/>
-          <w:b/>
-          <w:sz w:val="20"/>
-          <w:szCs w:val="20"/>
-        </w:rPr>
-        <w:t>urrent</w:t>
+        <w:t>Current</w:t>
       </w:r>
     </w:p>
     <w:p>
@@ -840,43 +541,71 @@
           <w:sz w:val="20"/>
           <w:szCs w:val="20"/>
         </w:rPr>
-        <w:t xml:space="preserve">I took charge of the architecture of a project that had little progress over the five years before I joined. Took the initiative to </w:t>
-      </w:r>
-      <w:r>
-        <w:rPr>
-          <w:rFonts w:ascii="Arial" w:eastAsia="Arial" w:hAnsi="Arial" w:cs="Arial"/>
-          <w:color w:val="000000"/>
-          <w:sz w:val="20"/>
-          <w:szCs w:val="20"/>
-        </w:rPr>
-        <w:t xml:space="preserve">make decisions, designed the architecture, and drove the execution to successfully release the project into production and transition the </w:t>
-      </w:r>
-      <w:r>
-        <w:rPr>
-          <w:rFonts w:ascii="Arial" w:eastAsia="Arial" w:hAnsi="Arial" w:cs="Arial"/>
-          <w:color w:val="000000"/>
-          <w:sz w:val="20"/>
-          <w:szCs w:val="20"/>
-        </w:rPr>
-        <w:t>first customers into the new system within a year. Leveraging pragmatic architecture and design</w:t>
-      </w:r>
-      <w:r>
-        <w:rPr>
-          <w:rFonts w:ascii="Arial" w:eastAsia="Arial" w:hAnsi="Arial" w:cs="Arial"/>
-          <w:color w:val="000000"/>
-          <w:sz w:val="20"/>
-          <w:szCs w:val="20"/>
-        </w:rPr>
-        <w:t>s, I</w:t>
-      </w:r>
-      <w:r>
-        <w:rPr>
-          <w:rFonts w:ascii="Arial" w:eastAsia="Arial" w:hAnsi="Arial" w:cs="Arial"/>
-          <w:color w:val="000000"/>
-          <w:sz w:val="20"/>
-          <w:szCs w:val="20"/>
-        </w:rPr>
-        <w:t xml:space="preserve"> took a holistic approach to supporting a 20-person offshore dev team, in-house, and contract resources to get the first customers live in 9 months -- this included mentoring, guiding, and coaching. </w:t>
+        <w:t>Founder of Systems Sense Advisory. I ship 8</w:t>
+      </w:r>
+      <w:r>
+        <w:rPr>
+          <w:rFonts w:ascii="Arial" w:eastAsia="Arial" w:hAnsi="Arial" w:cs="Arial"/>
+          <w:color w:val="000000"/>
+          <w:sz w:val="20"/>
+          <w:szCs w:val="20"/>
+        </w:rPr>
+        <w:t xml:space="preserve"> - 12-week</w:t>
+      </w:r>
+      <w:r>
+        <w:rPr>
+          <w:rFonts w:ascii="Arial" w:eastAsia="Arial" w:hAnsi="Arial" w:cs="Arial"/>
+          <w:color w:val="000000"/>
+          <w:sz w:val="20"/>
+          <w:szCs w:val="20"/>
+        </w:rPr>
+        <w:t xml:space="preserve"> prototype MVPs, help teams adopt AI-powered software development, provide fractional CTO judgment (Advisor / Working CTO tiers), and run hands-on AI mentoring for engineers and small teams</w:t>
+      </w:r>
+      <w:r>
+        <w:rPr>
+          <w:rFonts w:ascii="Arial" w:eastAsia="Arial" w:hAnsi="Arial" w:cs="Arial"/>
+          <w:color w:val="000000"/>
+          <w:sz w:val="20"/>
+          <w:szCs w:val="20"/>
+        </w:rPr>
+        <w:t>.</w:t>
+      </w:r>
+      <w:r>
+        <w:rPr>
+          <w:rFonts w:ascii="Arial" w:eastAsia="Arial" w:hAnsi="Arial" w:cs="Arial"/>
+          <w:color w:val="000000"/>
+          <w:sz w:val="20"/>
+          <w:szCs w:val="20"/>
+        </w:rPr>
+        <w:br/>
+        <w:t>G</w:t>
+      </w:r>
+      <w:r>
+        <w:rPr>
+          <w:rFonts w:ascii="Arial" w:eastAsia="Arial" w:hAnsi="Arial" w:cs="Arial"/>
+          <w:color w:val="000000"/>
+          <w:sz w:val="20"/>
+          <w:szCs w:val="20"/>
+        </w:rPr>
+        <w:t xml:space="preserve">rounded in 20+ years </w:t>
+      </w:r>
+      <w:r>
+        <w:rPr>
+          <w:rFonts w:ascii="Arial" w:eastAsia="Arial" w:hAnsi="Arial" w:cs="Arial"/>
+          <w:color w:val="000000"/>
+          <w:sz w:val="20"/>
+          <w:szCs w:val="20"/>
+        </w:rPr>
+        <w:t xml:space="preserve">of </w:t>
+      </w:r>
+      <w:r>
+        <w:rPr>
+          <w:rFonts w:ascii="Arial" w:eastAsia="Arial" w:hAnsi="Arial" w:cs="Arial"/>
+          <w:color w:val="000000"/>
+          <w:sz w:val="20"/>
+          <w:szCs w:val="20"/>
+        </w:rPr>
+        <w:t>building serious systems. Peers describe my work as fast POCs that hold up, strong structural thinking, and organized delivery from idea to rollout. M&amp;A technical due diligence remains available as a focused secondary offering.</w:t>
       </w:r>
     </w:p>
     <w:p>
@@ -892,7 +621,7 @@
         </w:tabs>
         <w:rPr>
           <w:rFonts w:ascii="Arial" w:eastAsia="Arial" w:hAnsi="Arial" w:cs="Arial"/>
-          <w:color w:val="000000"/>
+          <w:b/>
           <w:sz w:val="20"/>
           <w:szCs w:val="20"/>
         </w:rPr>
@@ -914,63 +643,154 @@
           <w:color w:val="000000"/>
           <w:sz w:val="20"/>
           <w:szCs w:val="20"/>
-        </w:rPr>
-      </w:pPr>
-      <w:r>
-        <w:rPr>
-          <w:rFonts w:ascii="Arial" w:eastAsia="Arial" w:hAnsi="Arial" w:cs="Arial"/>
-          <w:color w:val="000000"/>
-          <w:sz w:val="20"/>
-          <w:szCs w:val="20"/>
-        </w:rPr>
-        <w:t>From there</w:t>
-      </w:r>
-      <w:r>
-        <w:rPr>
-          <w:rFonts w:ascii="Arial" w:eastAsia="Arial" w:hAnsi="Arial" w:cs="Arial"/>
-          <w:color w:val="000000"/>
-          <w:sz w:val="20"/>
-          <w:szCs w:val="20"/>
-        </w:rPr>
-        <w:t>,</w:t>
-      </w:r>
-      <w:r>
-        <w:rPr>
-          <w:rFonts w:ascii="Arial" w:eastAsia="Arial" w:hAnsi="Arial" w:cs="Arial"/>
-          <w:color w:val="000000"/>
-          <w:sz w:val="20"/>
-          <w:szCs w:val="20"/>
-        </w:rPr>
-        <w:t xml:space="preserve"> I focused on maturing the organization. The team's central objective was building a maintainable system with a keen emphasis on the traceability of data and activities. This focus reduced the overall cost of ownership for the business. Acting as a liaison between business units and technology and bridging the gap between onshore and offshore teams, I facilitated mutual understanding and guided </w:t>
-      </w:r>
-      <w:r>
-        <w:rPr>
-          <w:rFonts w:ascii="Arial" w:eastAsia="Arial" w:hAnsi="Arial" w:cs="Arial"/>
-          <w:color w:val="000000"/>
-          <w:sz w:val="20"/>
-          <w:szCs w:val="20"/>
-        </w:rPr>
-        <w:lastRenderedPageBreak/>
-        <w:t>decision-making. I then trained the product team to take ownership of the applications</w:t>
-      </w:r>
-      <w:r>
-        <w:rPr>
-          <w:rFonts w:ascii="Arial" w:eastAsia="Arial" w:hAnsi="Arial" w:cs="Arial"/>
-          <w:color w:val="000000"/>
-          <w:sz w:val="20"/>
-          <w:szCs w:val="20"/>
-        </w:rPr>
-        <w:t>,</w:t>
-      </w:r>
-      <w:r>
-        <w:rPr>
-          <w:rFonts w:ascii="Arial" w:eastAsia="Arial" w:hAnsi="Arial" w:cs="Arial"/>
-          <w:color w:val="000000"/>
-          <w:sz w:val="20"/>
-          <w:szCs w:val="20"/>
-        </w:rPr>
-        <w:t xml:space="preserve"> ensuring that I made myself fully replaceable.</w:t>
-      </w:r>
+          <w:highlight w:val="white"/>
+        </w:rPr>
+      </w:pPr>
+      <w:r>
+        <w:rPr>
+          <w:rFonts w:ascii="Arial" w:eastAsia="Arial" w:hAnsi="Arial" w:cs="Arial"/>
+          <w:b/>
+          <w:sz w:val="20"/>
+          <w:szCs w:val="20"/>
+        </w:rPr>
+        <w:t xml:space="preserve">Contractor </w:t>
+      </w:r>
+      <w:r>
+        <w:rPr>
+          <w:rFonts w:ascii="Arial" w:eastAsia="Arial" w:hAnsi="Arial" w:cs="Arial"/>
+          <w:b/>
+          <w:sz w:val="20"/>
+          <w:szCs w:val="20"/>
+        </w:rPr>
+        <w:t xml:space="preserve">| </w:t>
+      </w:r>
+      <w:r>
+        <w:rPr>
+          <w:rFonts w:ascii="Arial" w:eastAsia="Arial" w:hAnsi="Arial" w:cs="Arial"/>
+          <w:b/>
+          <w:sz w:val="20"/>
+          <w:szCs w:val="20"/>
+        </w:rPr>
+        <w:t>Pinnacle Group, Inc.</w:t>
+      </w:r>
+      <w:r>
+        <w:rPr>
+          <w:rFonts w:ascii="Arial" w:eastAsia="Arial" w:hAnsi="Arial" w:cs="Arial"/>
+          <w:b/>
+          <w:sz w:val="20"/>
+          <w:szCs w:val="20"/>
+        </w:rPr>
+        <w:t xml:space="preserve"> </w:t>
+      </w:r>
+      <w:r>
+        <w:rPr>
+          <w:rFonts w:ascii="Arial" w:eastAsia="Arial" w:hAnsi="Arial" w:cs="Arial"/>
+          <w:b/>
+          <w:sz w:val="20"/>
+          <w:szCs w:val="20"/>
+        </w:rPr>
+        <w:t xml:space="preserve">| </w:t>
+      </w:r>
+      <w:r>
+        <w:rPr>
+          <w:rFonts w:ascii="Arial" w:eastAsia="Arial" w:hAnsi="Arial" w:cs="Arial"/>
+          <w:b/>
+          <w:sz w:val="20"/>
+          <w:szCs w:val="20"/>
+        </w:rPr>
+        <w:t>Denver, CO</w:t>
+      </w:r>
+      <w:r>
+        <w:rPr>
+          <w:rFonts w:ascii="Arial" w:eastAsia="Arial" w:hAnsi="Arial" w:cs="Arial"/>
+          <w:b/>
+          <w:sz w:val="20"/>
+          <w:szCs w:val="20"/>
+        </w:rPr>
+        <w:tab/>
+      </w:r>
+      <w:proofErr w:type="gramStart"/>
+      <w:r>
+        <w:rPr>
+          <w:rFonts w:ascii="Arial" w:eastAsia="Arial" w:hAnsi="Arial" w:cs="Arial"/>
+          <w:b/>
+          <w:sz w:val="20"/>
+          <w:szCs w:val="20"/>
+        </w:rPr>
+        <w:t xml:space="preserve">Dec </w:t>
+      </w:r>
+      <w:r>
+        <w:rPr>
+          <w:rFonts w:ascii="Arial" w:eastAsia="Arial" w:hAnsi="Arial" w:cs="Arial"/>
+          <w:b/>
+          <w:sz w:val="20"/>
+          <w:szCs w:val="20"/>
+        </w:rPr>
+        <w:t xml:space="preserve"> 202</w:t>
+      </w:r>
+      <w:r>
+        <w:rPr>
+          <w:rFonts w:ascii="Arial" w:eastAsia="Arial" w:hAnsi="Arial" w:cs="Arial"/>
+          <w:b/>
+          <w:sz w:val="20"/>
+          <w:szCs w:val="20"/>
+        </w:rPr>
+        <w:t>5</w:t>
+      </w:r>
+      <w:proofErr w:type="gramEnd"/>
+      <w:r>
+        <w:rPr>
+          <w:rFonts w:ascii="Arial" w:eastAsia="Arial" w:hAnsi="Arial" w:cs="Arial"/>
+          <w:b/>
+          <w:sz w:val="20"/>
+          <w:szCs w:val="20"/>
+          <w:highlight w:val="white"/>
+        </w:rPr>
+        <w:t xml:space="preserve"> – </w:t>
+      </w:r>
+      <w:r>
+        <w:rPr>
+          <w:rFonts w:ascii="Arial" w:eastAsia="Arial" w:hAnsi="Arial" w:cs="Arial"/>
+          <w:b/>
+          <w:sz w:val="20"/>
+          <w:szCs w:val="20"/>
+        </w:rPr>
+        <w:t>Apr</w:t>
+      </w:r>
+      <w:r>
+        <w:rPr>
+          <w:rFonts w:ascii="Arial" w:eastAsia="Arial" w:hAnsi="Arial" w:cs="Arial"/>
+          <w:b/>
+          <w:sz w:val="20"/>
+          <w:szCs w:val="20"/>
+        </w:rPr>
+        <w:t xml:space="preserve"> 202</w:t>
+      </w:r>
+      <w:r>
+        <w:rPr>
+          <w:rFonts w:ascii="Arial" w:eastAsia="Arial" w:hAnsi="Arial" w:cs="Arial"/>
+          <w:b/>
+          <w:sz w:val="20"/>
+          <w:szCs w:val="20"/>
+        </w:rPr>
+        <w:t>6</w:t>
+      </w:r>
+    </w:p>
+    <w:p>
+      <w:pPr>
+        <w:pBdr>
+          <w:top w:val="nil"/>
+          <w:left w:val="nil"/>
+          <w:right w:val="nil"/>
+          <w:between w:val="nil"/>
+        </w:pBdr>
+        <w:rPr>
+          <w:rFonts w:ascii="Arial" w:eastAsia="Arial" w:hAnsi="Arial" w:cs="Arial"/>
+          <w:color w:val="000000"/>
+          <w:sz w:val="20"/>
+          <w:szCs w:val="20"/>
+        </w:rPr>
+      </w:pPr>
     </w:p>
     <w:p>
       <w:pPr>
@@ -990,6 +810,15 @@
           <w:szCs w:val="20"/>
         </w:rPr>
       </w:pPr>
+      <w:r>
+        <w:rPr>
+          <w:rFonts w:ascii="Arial" w:eastAsia="Arial" w:hAnsi="Arial" w:cs="Arial"/>
+          <w:color w:val="000000"/>
+          <w:sz w:val="20"/>
+          <w:szCs w:val="20"/>
+        </w:rPr>
+        <w:t>Helped a Charter engineering team with AI training and prototypes: structured sessions, exercises, and POCs focused on context management, agents, and day-to-day AI habits—scoped to that group, not enterprise-wide. Also prototyped an agentic knowledge management tool to support integration work for an acquisition.</w:t>
+      </w:r>
     </w:p>
     <w:p>
       <w:pPr>
@@ -1009,24 +838,6 @@
           <w:szCs w:val="20"/>
         </w:rPr>
       </w:pPr>
-      <w:r>
-        <w:rPr>
-          <w:rFonts w:ascii="Arial" w:eastAsia="Arial" w:hAnsi="Arial" w:cs="Arial"/>
-          <w:color w:val="000000"/>
-          <w:sz w:val="20"/>
-          <w:szCs w:val="20"/>
-        </w:rPr>
-        <w:t xml:space="preserve">In June of 2025, MBO Partners was acquired by Beeline. </w:t>
-      </w:r>
-      <w:r>
-        <w:rPr>
-          <w:rFonts w:ascii="Arial" w:eastAsia="Arial" w:hAnsi="Arial" w:cs="Arial"/>
-          <w:color w:val="000000"/>
-          <w:sz w:val="20"/>
-          <w:szCs w:val="20"/>
-        </w:rPr>
-        <w:t xml:space="preserve"> </w:t>
-      </w:r>
     </w:p>
     <w:p>
       <w:pPr>
@@ -1044,6 +855,141 @@
           <w:color w:val="000000"/>
           <w:sz w:val="20"/>
           <w:szCs w:val="20"/>
+          <w:highlight w:val="white"/>
+        </w:rPr>
+      </w:pPr>
+      <w:r>
+        <w:rPr>
+          <w:rFonts w:ascii="Arial" w:eastAsia="Arial" w:hAnsi="Arial" w:cs="Arial"/>
+          <w:b/>
+          <w:sz w:val="20"/>
+          <w:szCs w:val="20"/>
+        </w:rPr>
+        <w:t>Enterprise</w:t>
+      </w:r>
+      <w:r>
+        <w:rPr>
+          <w:rFonts w:ascii="Arial" w:eastAsia="Arial" w:hAnsi="Arial" w:cs="Arial"/>
+          <w:b/>
+          <w:sz w:val="20"/>
+          <w:szCs w:val="20"/>
+        </w:rPr>
+        <w:t xml:space="preserve"> Architect</w:t>
+      </w:r>
+      <w:r>
+        <w:rPr>
+          <w:rFonts w:ascii="Arial" w:eastAsia="Arial" w:hAnsi="Arial" w:cs="Arial"/>
+          <w:b/>
+          <w:sz w:val="20"/>
+          <w:szCs w:val="20"/>
+        </w:rPr>
+        <w:t xml:space="preserve"> | </w:t>
+      </w:r>
+      <w:r>
+        <w:rPr>
+          <w:rFonts w:ascii="Arial" w:eastAsia="Arial" w:hAnsi="Arial" w:cs="Arial"/>
+          <w:b/>
+          <w:sz w:val="20"/>
+          <w:szCs w:val="20"/>
+        </w:rPr>
+        <w:t xml:space="preserve">Beeline - </w:t>
+      </w:r>
+      <w:r>
+        <w:rPr>
+          <w:rFonts w:ascii="Arial" w:eastAsia="Arial" w:hAnsi="Arial" w:cs="Arial"/>
+          <w:b/>
+          <w:sz w:val="20"/>
+          <w:szCs w:val="20"/>
+        </w:rPr>
+        <w:t xml:space="preserve">MBO </w:t>
+      </w:r>
+      <w:r>
+        <w:rPr>
+          <w:rFonts w:ascii="Arial" w:eastAsia="Arial" w:hAnsi="Arial" w:cs="Arial"/>
+          <w:b/>
+          <w:sz w:val="20"/>
+          <w:szCs w:val="20"/>
+        </w:rPr>
+        <w:t>Partners</w:t>
+      </w:r>
+      <w:r>
+        <w:rPr>
+          <w:rFonts w:ascii="Arial" w:eastAsia="Arial" w:hAnsi="Arial" w:cs="Arial"/>
+          <w:b/>
+          <w:sz w:val="20"/>
+          <w:szCs w:val="20"/>
+        </w:rPr>
+        <w:t xml:space="preserve"> | </w:t>
+      </w:r>
+      <w:r>
+        <w:rPr>
+          <w:rFonts w:ascii="Arial" w:eastAsia="Arial" w:hAnsi="Arial" w:cs="Arial"/>
+          <w:b/>
+          <w:sz w:val="20"/>
+          <w:szCs w:val="20"/>
+        </w:rPr>
+        <w:t>Remote</w:t>
+      </w:r>
+      <w:r>
+        <w:rPr>
+          <w:rFonts w:ascii="Arial" w:eastAsia="Arial" w:hAnsi="Arial" w:cs="Arial"/>
+          <w:b/>
+          <w:sz w:val="20"/>
+          <w:szCs w:val="20"/>
+        </w:rPr>
+        <w:tab/>
+      </w:r>
+      <w:r>
+        <w:rPr>
+          <w:rFonts w:ascii="Arial" w:eastAsia="Arial" w:hAnsi="Arial" w:cs="Arial"/>
+          <w:b/>
+          <w:sz w:val="20"/>
+          <w:szCs w:val="20"/>
+        </w:rPr>
+        <w:t>Jan</w:t>
+      </w:r>
+      <w:r>
+        <w:rPr>
+          <w:rFonts w:ascii="Arial" w:eastAsia="Arial" w:hAnsi="Arial" w:cs="Arial"/>
+          <w:b/>
+          <w:sz w:val="20"/>
+          <w:szCs w:val="20"/>
+        </w:rPr>
+        <w:t xml:space="preserve"> 2022</w:t>
+      </w:r>
+      <w:r>
+        <w:rPr>
+          <w:rFonts w:ascii="Arial" w:eastAsia="Arial" w:hAnsi="Arial" w:cs="Arial"/>
+          <w:b/>
+          <w:sz w:val="20"/>
+          <w:szCs w:val="20"/>
+          <w:highlight w:val="white"/>
+        </w:rPr>
+        <w:t xml:space="preserve"> – </w:t>
+      </w:r>
+      <w:r>
+        <w:rPr>
+          <w:rFonts w:ascii="Arial" w:eastAsia="Arial" w:hAnsi="Arial" w:cs="Arial"/>
+          <w:b/>
+          <w:sz w:val="20"/>
+          <w:szCs w:val="20"/>
+        </w:rPr>
+        <w:t>Nov 2025</w:t>
+      </w:r>
+    </w:p>
+    <w:p>
+      <w:pPr>
+        <w:pBdr>
+          <w:top w:val="nil"/>
+          <w:left w:val="nil"/>
+          <w:right w:val="nil"/>
+          <w:between w:val="nil"/>
+        </w:pBdr>
+        <w:rPr>
+          <w:rFonts w:ascii="Arial" w:eastAsia="Arial" w:hAnsi="Arial" w:cs="Arial"/>
+          <w:color w:val="000000"/>
+          <w:sz w:val="20"/>
+          <w:szCs w:val="20"/>
         </w:rPr>
       </w:pPr>
     </w:p>
@@ -1072,7 +1018,53 @@
           <w:sz w:val="20"/>
           <w:szCs w:val="20"/>
         </w:rPr>
-        <w:t>The technology stack included Java and Kubernetes hosted on AWS, seamlessly integrating into JobDiva, SAP S/4HANA Cloud, Vertex, ADP, and Okta.</w:t>
+        <w:t xml:space="preserve">I took charge of the architecture of a project that had little progress over the five years before I joined. Took the initiative to </w:t>
+      </w:r>
+      <w:r>
+        <w:rPr>
+          <w:rFonts w:ascii="Arial" w:eastAsia="Arial" w:hAnsi="Arial" w:cs="Arial"/>
+          <w:color w:val="000000"/>
+          <w:sz w:val="20"/>
+          <w:szCs w:val="20"/>
+        </w:rPr>
+        <w:t xml:space="preserve">make decisions, designed the architecture, and drove the execution to successfully release the project into production and transition the </w:t>
+      </w:r>
+      <w:r>
+        <w:rPr>
+          <w:rFonts w:ascii="Arial" w:eastAsia="Arial" w:hAnsi="Arial" w:cs="Arial"/>
+          <w:color w:val="000000"/>
+          <w:sz w:val="20"/>
+          <w:szCs w:val="20"/>
+        </w:rPr>
+        <w:t>first customers into the new system within a year. Leveraging pragmatic architecture and design</w:t>
+      </w:r>
+      <w:r>
+        <w:rPr>
+          <w:rFonts w:ascii="Arial" w:eastAsia="Arial" w:hAnsi="Arial" w:cs="Arial"/>
+          <w:color w:val="000000"/>
+          <w:sz w:val="20"/>
+          <w:szCs w:val="20"/>
+        </w:rPr>
+        <w:t>s, I</w:t>
+      </w:r>
+      <w:r>
+        <w:rPr>
+          <w:rFonts w:ascii="Arial" w:eastAsia="Arial" w:hAnsi="Arial" w:cs="Arial"/>
+          <w:color w:val="000000"/>
+          <w:sz w:val="20"/>
+          <w:szCs w:val="20"/>
+        </w:rPr>
+        <w:t xml:space="preserve"> took a holistic approach to supporting a 20-person </w:t>
+      </w:r>
+      <w:r>
+        <w:rPr>
+          <w:rFonts w:ascii="Arial" w:eastAsia="Arial" w:hAnsi="Arial" w:cs="Arial"/>
+          <w:color w:val="000000"/>
+          <w:sz w:val="20"/>
+          <w:szCs w:val="20"/>
+        </w:rPr>
+        <w:lastRenderedPageBreak/>
+        <w:t>offshore dev team, in-house, and contract resources to get the first customers live in 9 months -- this included mentoring, guiding, and coaching. </w:t>
       </w:r>
     </w:p>
     <w:p>
@@ -1088,7 +1080,7 @@
         </w:tabs>
         <w:rPr>
           <w:rFonts w:ascii="Arial" w:eastAsia="Arial" w:hAnsi="Arial" w:cs="Arial"/>
-          <w:b/>
+          <w:color w:val="000000"/>
           <w:sz w:val="20"/>
           <w:szCs w:val="20"/>
         </w:rPr>
@@ -1110,116 +1102,120 @@
           <w:color w:val="000000"/>
           <w:sz w:val="20"/>
           <w:szCs w:val="20"/>
-          <w:highlight w:val="white"/>
-        </w:rPr>
-      </w:pPr>
-      <w:r>
-        <w:rPr>
-          <w:rFonts w:ascii="Arial" w:eastAsia="Arial" w:hAnsi="Arial" w:cs="Arial"/>
-          <w:b/>
-          <w:sz w:val="20"/>
-          <w:szCs w:val="20"/>
-        </w:rPr>
-        <w:t>Senior Developer | Charles Schwab</w:t>
-      </w:r>
-      <w:r>
-        <w:rPr>
-          <w:rFonts w:ascii="Arial" w:eastAsia="Arial" w:hAnsi="Arial" w:cs="Arial"/>
-          <w:b/>
-          <w:sz w:val="20"/>
-          <w:szCs w:val="20"/>
-        </w:rPr>
-        <w:t xml:space="preserve"> | </w:t>
-      </w:r>
-      <w:r>
-        <w:rPr>
-          <w:rFonts w:ascii="Arial" w:eastAsia="Arial" w:hAnsi="Arial" w:cs="Arial"/>
-          <w:b/>
-          <w:sz w:val="20"/>
-          <w:szCs w:val="20"/>
-        </w:rPr>
-        <w:t>Remote</w:t>
-      </w:r>
-      <w:r>
-        <w:rPr>
-          <w:rFonts w:ascii="Arial" w:eastAsia="Arial" w:hAnsi="Arial" w:cs="Arial"/>
-          <w:b/>
-          <w:sz w:val="20"/>
-          <w:szCs w:val="20"/>
-        </w:rPr>
-        <w:tab/>
-      </w:r>
-      <w:r>
-        <w:rPr>
-          <w:rFonts w:ascii="Arial" w:eastAsia="Arial" w:hAnsi="Arial" w:cs="Arial"/>
-          <w:b/>
-          <w:sz w:val="20"/>
-          <w:szCs w:val="20"/>
-        </w:rPr>
-        <w:t>Jul</w:t>
-      </w:r>
-      <w:r>
-        <w:rPr>
-          <w:rFonts w:ascii="Arial" w:eastAsia="Arial" w:hAnsi="Arial" w:cs="Arial"/>
-          <w:b/>
-          <w:sz w:val="20"/>
-          <w:szCs w:val="20"/>
-        </w:rPr>
-        <w:t xml:space="preserve"> 202</w:t>
-      </w:r>
-      <w:r>
-        <w:rPr>
-          <w:rFonts w:ascii="Arial" w:eastAsia="Arial" w:hAnsi="Arial" w:cs="Arial"/>
-          <w:b/>
-          <w:sz w:val="20"/>
-          <w:szCs w:val="20"/>
-        </w:rPr>
-        <w:t>0</w:t>
-      </w:r>
-      <w:r>
-        <w:rPr>
-          <w:rFonts w:ascii="Arial" w:eastAsia="Arial" w:hAnsi="Arial" w:cs="Arial"/>
-          <w:b/>
-          <w:sz w:val="20"/>
-          <w:szCs w:val="20"/>
-          <w:highlight w:val="white"/>
-        </w:rPr>
-        <w:t xml:space="preserve"> – </w:t>
-      </w:r>
-      <w:r>
-        <w:rPr>
-          <w:rFonts w:ascii="Arial" w:eastAsia="Arial" w:hAnsi="Arial" w:cs="Arial"/>
-          <w:b/>
-          <w:sz w:val="20"/>
-          <w:szCs w:val="20"/>
-        </w:rPr>
-        <w:t>Jan</w:t>
-      </w:r>
-      <w:r>
-        <w:rPr>
-          <w:rFonts w:ascii="Arial" w:eastAsia="Arial" w:hAnsi="Arial" w:cs="Arial"/>
-          <w:b/>
-          <w:sz w:val="20"/>
-          <w:szCs w:val="20"/>
-        </w:rPr>
-        <w:t xml:space="preserve"> 2022</w:t>
-      </w:r>
-    </w:p>
-    <w:p>
-      <w:pPr>
-        <w:pBdr>
-          <w:top w:val="nil"/>
-          <w:left w:val="nil"/>
-          <w:right w:val="nil"/>
-          <w:between w:val="nil"/>
-        </w:pBdr>
-        <w:rPr>
-          <w:rFonts w:ascii="Arial" w:eastAsia="Arial" w:hAnsi="Arial" w:cs="Arial"/>
-          <w:color w:val="000000"/>
-          <w:sz w:val="20"/>
-          <w:szCs w:val="20"/>
-        </w:rPr>
-      </w:pPr>
+        </w:rPr>
+      </w:pPr>
+      <w:r>
+        <w:rPr>
+          <w:rFonts w:ascii="Arial" w:eastAsia="Arial" w:hAnsi="Arial" w:cs="Arial"/>
+          <w:color w:val="000000"/>
+          <w:sz w:val="20"/>
+          <w:szCs w:val="20"/>
+        </w:rPr>
+        <w:t>From there</w:t>
+      </w:r>
+      <w:r>
+        <w:rPr>
+          <w:rFonts w:ascii="Arial" w:eastAsia="Arial" w:hAnsi="Arial" w:cs="Arial"/>
+          <w:color w:val="000000"/>
+          <w:sz w:val="20"/>
+          <w:szCs w:val="20"/>
+        </w:rPr>
+        <w:t>,</w:t>
+      </w:r>
+      <w:r>
+        <w:rPr>
+          <w:rFonts w:ascii="Arial" w:eastAsia="Arial" w:hAnsi="Arial" w:cs="Arial"/>
+          <w:color w:val="000000"/>
+          <w:sz w:val="20"/>
+          <w:szCs w:val="20"/>
+        </w:rPr>
+        <w:t xml:space="preserve"> I focused on maturing the organization. The team's central objective was building a maintainable system with a keen emphasis on the traceability of data and activities. This focus reduced the overall cost of ownership for the business. Acting as a liaison between business units and technology and </w:t>
+      </w:r>
+      <w:proofErr w:type="gramStart"/>
+      <w:r>
+        <w:rPr>
+          <w:rFonts w:ascii="Arial" w:eastAsia="Arial" w:hAnsi="Arial" w:cs="Arial"/>
+          <w:color w:val="000000"/>
+          <w:sz w:val="20"/>
+          <w:szCs w:val="20"/>
+        </w:rPr>
+        <w:t>bridging</w:t>
+      </w:r>
+      <w:proofErr w:type="gramEnd"/>
+      <w:r>
+        <w:rPr>
+          <w:rFonts w:ascii="Arial" w:eastAsia="Arial" w:hAnsi="Arial" w:cs="Arial"/>
+          <w:color w:val="000000"/>
+          <w:sz w:val="20"/>
+          <w:szCs w:val="20"/>
+        </w:rPr>
+        <w:t xml:space="preserve"> the gap between onshore and offshore teams, I facilitated mutual understanding and guided decision-making. I then trained the product team to take ownership of the applications</w:t>
+      </w:r>
+      <w:r>
+        <w:rPr>
+          <w:rFonts w:ascii="Arial" w:eastAsia="Arial" w:hAnsi="Arial" w:cs="Arial"/>
+          <w:color w:val="000000"/>
+          <w:sz w:val="20"/>
+          <w:szCs w:val="20"/>
+        </w:rPr>
+        <w:t>,</w:t>
+      </w:r>
+      <w:r>
+        <w:rPr>
+          <w:rFonts w:ascii="Arial" w:eastAsia="Arial" w:hAnsi="Arial" w:cs="Arial"/>
+          <w:color w:val="000000"/>
+          <w:sz w:val="20"/>
+          <w:szCs w:val="20"/>
+        </w:rPr>
+        <w:t xml:space="preserve"> ensuring that I made myself fully replaceable.</w:t>
+      </w:r>
+      <w:r>
+        <w:rPr>
+          <w:rFonts w:ascii="Arial" w:eastAsia="Arial" w:hAnsi="Arial" w:cs="Arial"/>
+          <w:color w:val="000000"/>
+          <w:sz w:val="20"/>
+          <w:szCs w:val="20"/>
+        </w:rPr>
+        <w:br/>
+      </w:r>
+      <w:r>
+        <w:rPr>
+          <w:rFonts w:ascii="Arial" w:eastAsia="Arial" w:hAnsi="Arial" w:cs="Arial"/>
+          <w:color w:val="000000"/>
+          <w:sz w:val="20"/>
+          <w:szCs w:val="20"/>
+        </w:rPr>
+        <w:br/>
+      </w:r>
+      <w:r>
+        <w:rPr>
+          <w:rFonts w:ascii="Arial" w:eastAsia="Arial" w:hAnsi="Arial" w:cs="Arial"/>
+          <w:color w:val="000000"/>
+          <w:sz w:val="20"/>
+          <w:szCs w:val="20"/>
+        </w:rPr>
+        <w:t xml:space="preserve">I also prototyped, tested, and </w:t>
+      </w:r>
+      <w:proofErr w:type="gramStart"/>
+      <w:r>
+        <w:rPr>
+          <w:rFonts w:ascii="Arial" w:eastAsia="Arial" w:hAnsi="Arial" w:cs="Arial"/>
+          <w:color w:val="000000"/>
+          <w:sz w:val="20"/>
+          <w:szCs w:val="20"/>
+        </w:rPr>
+        <w:t>productized</w:t>
+      </w:r>
+      <w:proofErr w:type="gramEnd"/>
+      <w:r>
+        <w:rPr>
+          <w:rFonts w:ascii="Arial" w:eastAsia="Arial" w:hAnsi="Arial" w:cs="Arial"/>
+          <w:color w:val="000000"/>
+          <w:sz w:val="20"/>
+          <w:szCs w:val="20"/>
+        </w:rPr>
+        <w:t xml:space="preserve"> AI solutions.</w:t>
+      </w:r>
     </w:p>
     <w:p>
       <w:pPr>
@@ -1239,33 +1235,6 @@
           <w:szCs w:val="20"/>
         </w:rPr>
       </w:pPr>
-      <w:r>
-        <w:rPr>
-          <w:rFonts w:ascii="Arial" w:eastAsia="Arial" w:hAnsi="Arial" w:cs="Arial"/>
-          <w:color w:val="000000"/>
-          <w:sz w:val="20"/>
-          <w:szCs w:val="20"/>
-        </w:rPr>
-        <w:t xml:space="preserve">Assisted in maintenance and enhancements of the intelligent portfolio product. Prototyped new technology that provided visibility into the service mesh by taking machine-oriented data and presenting it in a human-centric fashion. I developed this proof of concept with C#, Blazor, Docker, and Kafka. Advised the lower environment strategy and prototyping </w:t>
-      </w:r>
-      <w:r>
-        <w:rPr>
-          <w:rFonts w:ascii="Arial" w:eastAsia="Arial" w:hAnsi="Arial" w:cs="Arial"/>
-          <w:color w:val="000000"/>
-          <w:sz w:val="20"/>
-          <w:szCs w:val="20"/>
-        </w:rPr>
-        <w:t xml:space="preserve">of </w:t>
-      </w:r>
-      <w:r>
-        <w:rPr>
-          <w:rFonts w:ascii="Arial" w:eastAsia="Arial" w:hAnsi="Arial" w:cs="Arial"/>
-          <w:color w:val="000000"/>
-          <w:sz w:val="20"/>
-          <w:szCs w:val="20"/>
-        </w:rPr>
-        <w:t>new technologies to improve testing outcomes.</w:t>
-      </w:r>
     </w:p>
     <w:p>
       <w:pPr>
@@ -1285,6 +1254,24 @@
           <w:szCs w:val="20"/>
         </w:rPr>
       </w:pPr>
+      <w:r>
+        <w:rPr>
+          <w:rFonts w:ascii="Arial" w:eastAsia="Arial" w:hAnsi="Arial" w:cs="Arial"/>
+          <w:color w:val="000000"/>
+          <w:sz w:val="20"/>
+          <w:szCs w:val="20"/>
+        </w:rPr>
+        <w:t xml:space="preserve">In June of 2025, MBO Partners was acquired by Beeline. </w:t>
+      </w:r>
+      <w:r>
+        <w:rPr>
+          <w:rFonts w:ascii="Arial" w:eastAsia="Arial" w:hAnsi="Arial" w:cs="Arial"/>
+          <w:color w:val="000000"/>
+          <w:sz w:val="20"/>
+          <w:szCs w:val="20"/>
+        </w:rPr>
+        <w:t xml:space="preserve"> </w:t>
+      </w:r>
     </w:p>
     <w:p>
       <w:pPr>
@@ -1299,7 +1286,7 @@
         </w:tabs>
         <w:rPr>
           <w:rFonts w:ascii="Arial" w:eastAsia="Arial" w:hAnsi="Arial" w:cs="Arial"/>
-          <w:b/>
+          <w:color w:val="000000"/>
           <w:sz w:val="20"/>
           <w:szCs w:val="20"/>
         </w:rPr>
@@ -1321,548 +1308,37 @@
           <w:color w:val="000000"/>
           <w:sz w:val="20"/>
           <w:szCs w:val="20"/>
-          <w:highlight w:val="white"/>
-        </w:rPr>
-      </w:pPr>
-      <w:r>
-        <w:rPr>
-          <w:rFonts w:ascii="Arial" w:eastAsia="Arial" w:hAnsi="Arial" w:cs="Arial"/>
-          <w:b/>
-          <w:sz w:val="20"/>
-          <w:szCs w:val="20"/>
-        </w:rPr>
-        <w:t>Founder</w:t>
-      </w:r>
-      <w:r>
-        <w:rPr>
-          <w:rFonts w:ascii="Arial" w:eastAsia="Arial" w:hAnsi="Arial" w:cs="Arial"/>
-          <w:b/>
-          <w:sz w:val="20"/>
-          <w:szCs w:val="20"/>
-        </w:rPr>
-        <w:t xml:space="preserve"> </w:t>
-      </w:r>
-      <w:r>
-        <w:rPr>
-          <w:rFonts w:ascii="Arial" w:eastAsia="Arial" w:hAnsi="Arial" w:cs="Arial"/>
-          <w:b/>
-          <w:sz w:val="20"/>
-          <w:szCs w:val="20"/>
-        </w:rPr>
-        <w:t xml:space="preserve">| </w:t>
-      </w:r>
-      <w:r>
-        <w:rPr>
-          <w:rFonts w:ascii="Arial" w:eastAsia="Arial" w:hAnsi="Arial" w:cs="Arial"/>
-          <w:b/>
-          <w:sz w:val="20"/>
-          <w:szCs w:val="20"/>
-        </w:rPr>
-        <w:t>Possum Labs | Denver</w:t>
-      </w:r>
-      <w:r>
-        <w:rPr>
-          <w:rFonts w:ascii="Arial" w:eastAsia="Arial" w:hAnsi="Arial" w:cs="Arial"/>
-          <w:b/>
-          <w:sz w:val="20"/>
-          <w:szCs w:val="20"/>
-        </w:rPr>
-        <w:t>, CO</w:t>
-      </w:r>
-      <w:r>
-        <w:rPr>
-          <w:rFonts w:ascii="Arial" w:eastAsia="Arial" w:hAnsi="Arial" w:cs="Arial"/>
-          <w:b/>
-          <w:sz w:val="20"/>
-          <w:szCs w:val="20"/>
-        </w:rPr>
-        <w:tab/>
-      </w:r>
-      <w:r>
-        <w:rPr>
-          <w:rFonts w:ascii="Arial" w:eastAsia="Arial" w:hAnsi="Arial" w:cs="Arial"/>
-          <w:b/>
-          <w:sz w:val="20"/>
-          <w:szCs w:val="20"/>
-        </w:rPr>
-        <w:t>Jan</w:t>
-      </w:r>
-      <w:r>
-        <w:rPr>
-          <w:rFonts w:ascii="Arial" w:eastAsia="Arial" w:hAnsi="Arial" w:cs="Arial"/>
-          <w:b/>
-          <w:sz w:val="20"/>
-          <w:szCs w:val="20"/>
-        </w:rPr>
-        <w:t xml:space="preserve"> 2018</w:t>
-      </w:r>
-      <w:r>
-        <w:rPr>
-          <w:rFonts w:ascii="Arial" w:eastAsia="Arial" w:hAnsi="Arial" w:cs="Arial"/>
-          <w:b/>
-          <w:sz w:val="20"/>
-          <w:szCs w:val="20"/>
-          <w:highlight w:val="white"/>
-        </w:rPr>
-        <w:t xml:space="preserve"> – </w:t>
-      </w:r>
-      <w:r>
-        <w:rPr>
-          <w:rFonts w:ascii="Arial" w:eastAsia="Arial" w:hAnsi="Arial" w:cs="Arial"/>
-          <w:b/>
-          <w:sz w:val="20"/>
-          <w:szCs w:val="20"/>
-        </w:rPr>
-        <w:t>Apr</w:t>
-      </w:r>
-      <w:r>
-        <w:rPr>
-          <w:rFonts w:ascii="Arial" w:eastAsia="Arial" w:hAnsi="Arial" w:cs="Arial"/>
-          <w:b/>
-          <w:sz w:val="20"/>
-          <w:szCs w:val="20"/>
-        </w:rPr>
-        <w:t xml:space="preserve"> 202</w:t>
-      </w:r>
-      <w:r>
-        <w:rPr>
-          <w:rFonts w:ascii="Arial" w:eastAsia="Arial" w:hAnsi="Arial" w:cs="Arial"/>
-          <w:b/>
-          <w:sz w:val="20"/>
-          <w:szCs w:val="20"/>
-        </w:rPr>
-        <w:t>0</w:t>
-      </w:r>
-    </w:p>
-    <w:p>
-      <w:pPr>
-        <w:pBdr>
-          <w:top w:val="nil"/>
-          <w:left w:val="nil"/>
-          <w:right w:val="nil"/>
-          <w:between w:val="nil"/>
-        </w:pBdr>
-        <w:rPr>
-          <w:rFonts w:ascii="Arial" w:eastAsia="Arial" w:hAnsi="Arial" w:cs="Arial"/>
-          <w:sz w:val="20"/>
-          <w:szCs w:val="20"/>
-        </w:rPr>
-      </w:pPr>
-    </w:p>
-    <w:p>
-      <w:pPr>
-        <w:pBdr>
-          <w:top w:val="nil"/>
-          <w:left w:val="nil"/>
-          <w:right w:val="nil"/>
-          <w:between w:val="nil"/>
-        </w:pBdr>
-        <w:rPr>
-          <w:rFonts w:ascii="Arial" w:eastAsia="Arial" w:hAnsi="Arial" w:cs="Arial"/>
-          <w:sz w:val="20"/>
-          <w:szCs w:val="20"/>
-        </w:rPr>
-      </w:pPr>
-      <w:r>
-        <w:rPr>
-          <w:rFonts w:ascii="Arial" w:eastAsia="Arial" w:hAnsi="Arial" w:cs="Arial"/>
-          <w:sz w:val="20"/>
-          <w:szCs w:val="20"/>
-        </w:rPr>
-        <w:t xml:space="preserve">In 2018, the consulting company </w:t>
-      </w:r>
-      <w:r>
-        <w:rPr>
-          <w:rFonts w:ascii="Arial" w:eastAsia="Arial" w:hAnsi="Arial" w:cs="Arial"/>
-          <w:sz w:val="20"/>
-          <w:szCs w:val="20"/>
-        </w:rPr>
-        <w:t>transformed into a product company</w:t>
-      </w:r>
-      <w:r>
-        <w:rPr>
-          <w:rFonts w:ascii="Arial" w:eastAsia="Arial" w:hAnsi="Arial" w:cs="Arial"/>
-          <w:sz w:val="20"/>
-          <w:szCs w:val="20"/>
-        </w:rPr>
-        <w:t>. We then developed and built</w:t>
-      </w:r>
-      <w:r>
-        <w:rPr>
-          <w:rFonts w:ascii="Arial" w:eastAsia="Arial" w:hAnsi="Arial" w:cs="Arial"/>
-          <w:color w:val="000000"/>
-          <w:sz w:val="20"/>
-          <w:szCs w:val="20"/>
-        </w:rPr>
-        <w:t xml:space="preserve"> a user-friendly web app for organizations’ business experts to describe desired outcomes for software in customizable </w:t>
-      </w:r>
-      <w:r>
-        <w:rPr>
-          <w:rFonts w:ascii="Arial" w:eastAsia="Arial" w:hAnsi="Arial" w:cs="Arial"/>
-          <w:sz w:val="20"/>
-          <w:szCs w:val="20"/>
-        </w:rPr>
-        <w:t>domain-specific</w:t>
-      </w:r>
-      <w:r>
-        <w:rPr>
-          <w:rFonts w:ascii="Arial" w:eastAsia="Arial" w:hAnsi="Arial" w:cs="Arial"/>
-          <w:color w:val="000000"/>
-          <w:sz w:val="20"/>
-          <w:szCs w:val="20"/>
-        </w:rPr>
-        <w:t xml:space="preserve"> languages. </w:t>
-      </w:r>
-      <w:r>
-        <w:rPr>
-          <w:rFonts w:ascii="Arial" w:eastAsia="Arial" w:hAnsi="Arial" w:cs="Arial"/>
-          <w:sz w:val="20"/>
-          <w:szCs w:val="20"/>
-        </w:rPr>
-        <w:t>It</w:t>
-      </w:r>
-      <w:r>
-        <w:rPr>
-          <w:rFonts w:ascii="Arial" w:eastAsia="Arial" w:hAnsi="Arial" w:cs="Arial"/>
-          <w:sz w:val="20"/>
-          <w:szCs w:val="20"/>
-        </w:rPr>
-        <w:t xml:space="preserve"> </w:t>
-      </w:r>
-      <w:r>
-        <w:rPr>
-          <w:rFonts w:ascii="Arial" w:eastAsia="Arial" w:hAnsi="Arial" w:cs="Arial"/>
-          <w:sz w:val="20"/>
-          <w:szCs w:val="20"/>
-        </w:rPr>
-        <w:t xml:space="preserve">allowed me to develop and architect, learn how to </w:t>
-      </w:r>
-      <w:r>
-        <w:rPr>
-          <w:rFonts w:ascii="Arial" w:eastAsia="Arial" w:hAnsi="Arial" w:cs="Arial"/>
-          <w:sz w:val="20"/>
-          <w:szCs w:val="20"/>
-        </w:rPr>
-        <w:t xml:space="preserve">run a business, </w:t>
-      </w:r>
-      <w:r>
-        <w:rPr>
-          <w:rFonts w:ascii="Arial" w:eastAsia="Arial" w:hAnsi="Arial" w:cs="Arial"/>
-          <w:sz w:val="20"/>
-          <w:szCs w:val="20"/>
-        </w:rPr>
-        <w:t>build</w:t>
-      </w:r>
-      <w:r>
-        <w:rPr>
-          <w:rFonts w:ascii="Arial" w:eastAsia="Arial" w:hAnsi="Arial" w:cs="Arial"/>
-          <w:sz w:val="20"/>
-          <w:szCs w:val="20"/>
-        </w:rPr>
-        <w:t xml:space="preserve"> </w:t>
-      </w:r>
-      <w:r>
-        <w:rPr>
-          <w:rFonts w:ascii="Arial" w:eastAsia="Arial" w:hAnsi="Arial" w:cs="Arial"/>
-          <w:sz w:val="20"/>
-          <w:szCs w:val="20"/>
-        </w:rPr>
-        <w:t>&amp;</w:t>
-      </w:r>
-      <w:r>
-        <w:rPr>
-          <w:rFonts w:ascii="Arial" w:eastAsia="Arial" w:hAnsi="Arial" w:cs="Arial"/>
-          <w:sz w:val="20"/>
-          <w:szCs w:val="20"/>
-        </w:rPr>
-        <w:t xml:space="preserve"> mentor a team,</w:t>
-      </w:r>
-      <w:r>
-        <w:rPr>
-          <w:rFonts w:ascii="Arial" w:eastAsia="Arial" w:hAnsi="Arial" w:cs="Arial"/>
-          <w:sz w:val="20"/>
-          <w:szCs w:val="20"/>
-        </w:rPr>
-        <w:t xml:space="preserve"> and</w:t>
-      </w:r>
-      <w:r>
-        <w:rPr>
-          <w:rFonts w:ascii="Arial" w:eastAsia="Arial" w:hAnsi="Arial" w:cs="Arial"/>
-          <w:sz w:val="20"/>
-          <w:szCs w:val="20"/>
-        </w:rPr>
-        <w:t xml:space="preserve"> work with customers</w:t>
-      </w:r>
-      <w:r>
-        <w:rPr>
-          <w:rFonts w:ascii="Arial" w:eastAsia="Arial" w:hAnsi="Arial" w:cs="Arial"/>
-          <w:sz w:val="20"/>
-          <w:szCs w:val="20"/>
-        </w:rPr>
-        <w:t>.</w:t>
-      </w:r>
-    </w:p>
-    <w:p>
-      <w:pPr>
-        <w:pBdr>
-          <w:top w:val="nil"/>
-          <w:left w:val="nil"/>
-          <w:right w:val="nil"/>
-          <w:between w:val="nil"/>
-        </w:pBdr>
-        <w:rPr>
-          <w:rFonts w:ascii="Arial" w:eastAsia="Arial" w:hAnsi="Arial" w:cs="Arial"/>
-          <w:sz w:val="20"/>
-          <w:szCs w:val="20"/>
-        </w:rPr>
-      </w:pPr>
-    </w:p>
-    <w:p>
-      <w:pPr>
-        <w:pBdr>
-          <w:top w:val="nil"/>
-          <w:left w:val="nil"/>
-          <w:right w:val="nil"/>
-          <w:between w:val="nil"/>
-        </w:pBdr>
-        <w:rPr>
-          <w:rFonts w:ascii="Arial" w:eastAsia="Arial" w:hAnsi="Arial" w:cs="Arial"/>
-          <w:sz w:val="20"/>
-          <w:szCs w:val="20"/>
-        </w:rPr>
-      </w:pPr>
-      <w:r>
-        <w:rPr>
-          <w:rFonts w:ascii="Arial" w:eastAsia="Arial" w:hAnsi="Arial" w:cs="Arial"/>
-          <w:sz w:val="20"/>
-          <w:szCs w:val="20"/>
-        </w:rPr>
-        <w:t>The architecture, development, and deployment were created with the budget in mind. Azure was the hosting platform</w:t>
-      </w:r>
-      <w:r>
-        <w:rPr>
-          <w:rFonts w:ascii="Arial" w:eastAsia="Arial" w:hAnsi="Arial" w:cs="Arial"/>
-          <w:sz w:val="20"/>
-          <w:szCs w:val="20"/>
-        </w:rPr>
-        <w:t>,</w:t>
-      </w:r>
-      <w:r>
-        <w:rPr>
-          <w:rFonts w:ascii="Arial" w:eastAsia="Arial" w:hAnsi="Arial" w:cs="Arial"/>
-          <w:sz w:val="20"/>
-          <w:szCs w:val="20"/>
-        </w:rPr>
-        <w:t xml:space="preserve"> </w:t>
-      </w:r>
-      <w:r>
-        <w:rPr>
-          <w:rFonts w:ascii="Arial" w:eastAsia="Arial" w:hAnsi="Arial" w:cs="Arial"/>
-          <w:sz w:val="20"/>
-          <w:szCs w:val="20"/>
-        </w:rPr>
-        <w:t>and</w:t>
-      </w:r>
-      <w:r>
-        <w:rPr>
-          <w:rFonts w:ascii="Arial" w:eastAsia="Arial" w:hAnsi="Arial" w:cs="Arial"/>
-          <w:sz w:val="20"/>
-          <w:szCs w:val="20"/>
-        </w:rPr>
-        <w:t xml:space="preserve"> </w:t>
-      </w:r>
-      <w:r>
-        <w:rPr>
-          <w:rFonts w:ascii="Arial" w:eastAsia="Arial" w:hAnsi="Arial" w:cs="Arial"/>
-          <w:sz w:val="20"/>
-          <w:szCs w:val="20"/>
-        </w:rPr>
-        <w:t>a Kubernetes hosting strategy was chosen to allow future flexibility</w:t>
-      </w:r>
-      <w:r>
-        <w:rPr>
-          <w:rFonts w:ascii="Arial" w:eastAsia="Arial" w:hAnsi="Arial" w:cs="Arial"/>
-          <w:sz w:val="20"/>
-          <w:szCs w:val="20"/>
-        </w:rPr>
-        <w:t>. Every operation in Azure was scripted to allow for environments to be provisioned as needed. The backend was written in C#</w:t>
-      </w:r>
-      <w:r>
-        <w:rPr>
-          <w:rFonts w:ascii="Arial" w:eastAsia="Arial" w:hAnsi="Arial" w:cs="Arial"/>
-          <w:sz w:val="20"/>
-          <w:szCs w:val="20"/>
-        </w:rPr>
-        <w:t>, focusing</w:t>
-      </w:r>
-      <w:r>
-        <w:rPr>
-          <w:rFonts w:ascii="Arial" w:eastAsia="Arial" w:hAnsi="Arial" w:cs="Arial"/>
-          <w:sz w:val="20"/>
-          <w:szCs w:val="20"/>
-        </w:rPr>
-        <w:t xml:space="preserve"> on clear and consistent naming to help onboard </w:t>
-      </w:r>
-      <w:r>
-        <w:rPr>
-          <w:rFonts w:ascii="Arial" w:eastAsia="Arial" w:hAnsi="Arial" w:cs="Arial"/>
-          <w:sz w:val="20"/>
-          <w:szCs w:val="20"/>
-        </w:rPr>
-        <w:t xml:space="preserve">engineers. Frontend development </w:t>
-      </w:r>
-      <w:r>
-        <w:rPr>
-          <w:rFonts w:ascii="Arial" w:eastAsia="Arial" w:hAnsi="Arial" w:cs="Arial"/>
-          <w:sz w:val="20"/>
-          <w:szCs w:val="20"/>
-        </w:rPr>
-        <w:t>leverage</w:t>
-      </w:r>
-      <w:r>
-        <w:rPr>
-          <w:rFonts w:ascii="Arial" w:eastAsia="Arial" w:hAnsi="Arial" w:cs="Arial"/>
-          <w:sz w:val="20"/>
-          <w:szCs w:val="20"/>
-        </w:rPr>
-        <w:t>d</w:t>
-      </w:r>
-      <w:r>
-        <w:rPr>
-          <w:rFonts w:ascii="Arial" w:eastAsia="Arial" w:hAnsi="Arial" w:cs="Arial"/>
-          <w:sz w:val="20"/>
-          <w:szCs w:val="20"/>
-        </w:rPr>
-        <w:t xml:space="preserve"> code generation. The </w:t>
-      </w:r>
-      <w:r>
-        <w:rPr>
-          <w:rFonts w:ascii="Arial" w:eastAsia="Arial" w:hAnsi="Arial" w:cs="Arial"/>
-          <w:sz w:val="20"/>
-          <w:szCs w:val="20"/>
-        </w:rPr>
-        <w:t>frontend</w:t>
-      </w:r>
-      <w:r>
-        <w:rPr>
-          <w:rFonts w:ascii="Arial" w:eastAsia="Arial" w:hAnsi="Arial" w:cs="Arial"/>
-          <w:sz w:val="20"/>
-          <w:szCs w:val="20"/>
-        </w:rPr>
-        <w:t xml:space="preserve"> was written in </w:t>
-      </w:r>
-      <w:r>
-        <w:rPr>
-          <w:rFonts w:ascii="Arial" w:eastAsia="Arial" w:hAnsi="Arial" w:cs="Arial"/>
-          <w:sz w:val="20"/>
-          <w:szCs w:val="20"/>
-        </w:rPr>
-        <w:t>A</w:t>
-      </w:r>
-      <w:r>
-        <w:rPr>
-          <w:rFonts w:ascii="Arial" w:eastAsia="Arial" w:hAnsi="Arial" w:cs="Arial"/>
-          <w:sz w:val="20"/>
-          <w:szCs w:val="20"/>
-        </w:rPr>
-        <w:t>ngular</w:t>
-      </w:r>
-      <w:r>
-        <w:rPr>
-          <w:rFonts w:ascii="Arial" w:eastAsia="Arial" w:hAnsi="Arial" w:cs="Arial"/>
-          <w:sz w:val="20"/>
-          <w:szCs w:val="20"/>
-        </w:rPr>
-        <w:t>; despite being</w:t>
-      </w:r>
-      <w:r>
-        <w:rPr>
-          <w:rFonts w:ascii="Arial" w:eastAsia="Arial" w:hAnsi="Arial" w:cs="Arial"/>
-          <w:sz w:val="20"/>
-          <w:szCs w:val="20"/>
-        </w:rPr>
-        <w:t xml:space="preserve"> a </w:t>
-      </w:r>
-      <w:r>
-        <w:rPr>
-          <w:rFonts w:ascii="Arial" w:eastAsia="Arial" w:hAnsi="Arial" w:cs="Arial"/>
-          <w:sz w:val="20"/>
-          <w:szCs w:val="20"/>
-        </w:rPr>
-        <w:t>heavy-weight</w:t>
-      </w:r>
-      <w:r>
-        <w:rPr>
-          <w:rFonts w:ascii="Arial" w:eastAsia="Arial" w:hAnsi="Arial" w:cs="Arial"/>
-          <w:sz w:val="20"/>
-          <w:szCs w:val="20"/>
-        </w:rPr>
-        <w:t xml:space="preserve"> solution</w:t>
-      </w:r>
-      <w:r>
-        <w:rPr>
-          <w:rFonts w:ascii="Arial" w:eastAsia="Arial" w:hAnsi="Arial" w:cs="Arial"/>
-          <w:sz w:val="20"/>
-          <w:szCs w:val="20"/>
-        </w:rPr>
-        <w:t>,</w:t>
-      </w:r>
-      <w:r>
-        <w:rPr>
-          <w:rFonts w:ascii="Arial" w:eastAsia="Arial" w:hAnsi="Arial" w:cs="Arial"/>
-          <w:sz w:val="20"/>
-          <w:szCs w:val="20"/>
-        </w:rPr>
-        <w:t xml:space="preserve"> it allowed for small components to be worked on by junior </w:t>
-      </w:r>
-      <w:r>
-        <w:rPr>
-          <w:rFonts w:ascii="Arial" w:eastAsia="Arial" w:hAnsi="Arial" w:cs="Arial"/>
-          <w:sz w:val="20"/>
-          <w:szCs w:val="20"/>
-        </w:rPr>
-        <w:t>engineers</w:t>
-      </w:r>
-      <w:r>
-        <w:rPr>
-          <w:rFonts w:ascii="Arial" w:eastAsia="Arial" w:hAnsi="Arial" w:cs="Arial"/>
-          <w:sz w:val="20"/>
-          <w:szCs w:val="20"/>
-        </w:rPr>
-        <w:t xml:space="preserve">. Although Angular is complex, making changes to a single component is not intimidating and allows junior resources to build proficiency and confidence, peeling back the layers as they </w:t>
-      </w:r>
-      <w:r>
-        <w:rPr>
-          <w:rFonts w:ascii="Arial" w:eastAsia="Arial" w:hAnsi="Arial" w:cs="Arial"/>
-          <w:sz w:val="20"/>
-          <w:szCs w:val="20"/>
-        </w:rPr>
-        <w:t>advance</w:t>
-      </w:r>
-      <w:r>
-        <w:rPr>
-          <w:rFonts w:ascii="Arial" w:eastAsia="Arial" w:hAnsi="Arial" w:cs="Arial"/>
-          <w:sz w:val="20"/>
-          <w:szCs w:val="20"/>
-        </w:rPr>
-        <w:t xml:space="preserve">. </w:t>
-      </w:r>
-    </w:p>
-    <w:p>
-      <w:pPr>
-        <w:pBdr>
-          <w:top w:val="nil"/>
-          <w:left w:val="nil"/>
-          <w:right w:val="nil"/>
-          <w:between w:val="nil"/>
-        </w:pBdr>
-        <w:rPr>
-          <w:rFonts w:ascii="Arial" w:eastAsia="Arial" w:hAnsi="Arial" w:cs="Arial"/>
-          <w:color w:val="000000"/>
-          <w:sz w:val="20"/>
-          <w:szCs w:val="20"/>
-        </w:rPr>
-      </w:pPr>
+        </w:rPr>
+      </w:pPr>
+      <w:r>
+        <w:rPr>
+          <w:rFonts w:ascii="Arial" w:eastAsia="Arial" w:hAnsi="Arial" w:cs="Arial"/>
+          <w:color w:val="000000"/>
+          <w:sz w:val="20"/>
+          <w:szCs w:val="20"/>
+        </w:rPr>
+        <w:t xml:space="preserve">The technology stack included Java and Kubernetes hosted on AWS, seamlessly integrating into </w:t>
+      </w:r>
+      <w:proofErr w:type="spellStart"/>
+      <w:r>
+        <w:rPr>
+          <w:rFonts w:ascii="Arial" w:eastAsia="Arial" w:hAnsi="Arial" w:cs="Arial"/>
+          <w:color w:val="000000"/>
+          <w:sz w:val="20"/>
+          <w:szCs w:val="20"/>
+        </w:rPr>
+        <w:t>JobDiva</w:t>
+      </w:r>
+      <w:proofErr w:type="spellEnd"/>
+      <w:r>
+        <w:rPr>
+          <w:rFonts w:ascii="Arial" w:eastAsia="Arial" w:hAnsi="Arial" w:cs="Arial"/>
+          <w:color w:val="000000"/>
+          <w:sz w:val="20"/>
+          <w:szCs w:val="20"/>
+        </w:rPr>
+        <w:t>, SAP S/4HANA Cloud, Vertex, ADP, and Okta.</w:t>
+      </w:r>
     </w:p>
     <w:p>
       <w:pPr>
@@ -1877,6 +1353,795 @@
         </w:tabs>
         <w:rPr>
           <w:rFonts w:ascii="Arial" w:eastAsia="Arial" w:hAnsi="Arial" w:cs="Arial"/>
+          <w:b/>
+          <w:sz w:val="20"/>
+          <w:szCs w:val="20"/>
+        </w:rPr>
+      </w:pPr>
+    </w:p>
+    <w:p>
+      <w:pPr>
+        <w:pBdr>
+          <w:top w:val="nil"/>
+          <w:left w:val="nil"/>
+          <w:right w:val="nil"/>
+          <w:between w:val="nil"/>
+        </w:pBdr>
+        <w:tabs>
+          <w:tab w:val="right" w:pos="9360"/>
+        </w:tabs>
+        <w:rPr>
+          <w:rFonts w:ascii="Arial" w:eastAsia="Arial" w:hAnsi="Arial" w:cs="Arial"/>
+          <w:color w:val="000000"/>
+          <w:sz w:val="20"/>
+          <w:szCs w:val="20"/>
+          <w:highlight w:val="white"/>
+        </w:rPr>
+      </w:pPr>
+      <w:r>
+        <w:rPr>
+          <w:rFonts w:ascii="Arial" w:eastAsia="Arial" w:hAnsi="Arial" w:cs="Arial"/>
+          <w:b/>
+          <w:sz w:val="20"/>
+          <w:szCs w:val="20"/>
+        </w:rPr>
+        <w:t>Senior Developer | Charles Schwab</w:t>
+      </w:r>
+      <w:r>
+        <w:rPr>
+          <w:rFonts w:ascii="Arial" w:eastAsia="Arial" w:hAnsi="Arial" w:cs="Arial"/>
+          <w:b/>
+          <w:sz w:val="20"/>
+          <w:szCs w:val="20"/>
+        </w:rPr>
+        <w:t xml:space="preserve"> | </w:t>
+      </w:r>
+      <w:r>
+        <w:rPr>
+          <w:rFonts w:ascii="Arial" w:eastAsia="Arial" w:hAnsi="Arial" w:cs="Arial"/>
+          <w:b/>
+          <w:sz w:val="20"/>
+          <w:szCs w:val="20"/>
+        </w:rPr>
+        <w:t>Remote</w:t>
+      </w:r>
+      <w:r>
+        <w:rPr>
+          <w:rFonts w:ascii="Arial" w:eastAsia="Arial" w:hAnsi="Arial" w:cs="Arial"/>
+          <w:b/>
+          <w:sz w:val="20"/>
+          <w:szCs w:val="20"/>
+        </w:rPr>
+        <w:tab/>
+      </w:r>
+      <w:r>
+        <w:rPr>
+          <w:rFonts w:ascii="Arial" w:eastAsia="Arial" w:hAnsi="Arial" w:cs="Arial"/>
+          <w:b/>
+          <w:sz w:val="20"/>
+          <w:szCs w:val="20"/>
+        </w:rPr>
+        <w:t>Jul</w:t>
+      </w:r>
+      <w:r>
+        <w:rPr>
+          <w:rFonts w:ascii="Arial" w:eastAsia="Arial" w:hAnsi="Arial" w:cs="Arial"/>
+          <w:b/>
+          <w:sz w:val="20"/>
+          <w:szCs w:val="20"/>
+        </w:rPr>
+        <w:t xml:space="preserve"> 202</w:t>
+      </w:r>
+      <w:r>
+        <w:rPr>
+          <w:rFonts w:ascii="Arial" w:eastAsia="Arial" w:hAnsi="Arial" w:cs="Arial"/>
+          <w:b/>
+          <w:sz w:val="20"/>
+          <w:szCs w:val="20"/>
+        </w:rPr>
+        <w:t>0</w:t>
+      </w:r>
+      <w:r>
+        <w:rPr>
+          <w:rFonts w:ascii="Arial" w:eastAsia="Arial" w:hAnsi="Arial" w:cs="Arial"/>
+          <w:b/>
+          <w:sz w:val="20"/>
+          <w:szCs w:val="20"/>
+          <w:highlight w:val="white"/>
+        </w:rPr>
+        <w:t xml:space="preserve"> – </w:t>
+      </w:r>
+      <w:r>
+        <w:rPr>
+          <w:rFonts w:ascii="Arial" w:eastAsia="Arial" w:hAnsi="Arial" w:cs="Arial"/>
+          <w:b/>
+          <w:sz w:val="20"/>
+          <w:szCs w:val="20"/>
+        </w:rPr>
+        <w:t>Jan</w:t>
+      </w:r>
+      <w:r>
+        <w:rPr>
+          <w:rFonts w:ascii="Arial" w:eastAsia="Arial" w:hAnsi="Arial" w:cs="Arial"/>
+          <w:b/>
+          <w:sz w:val="20"/>
+          <w:szCs w:val="20"/>
+        </w:rPr>
+        <w:t xml:space="preserve"> 2022</w:t>
+      </w:r>
+    </w:p>
+    <w:p>
+      <w:pPr>
+        <w:pBdr>
+          <w:top w:val="nil"/>
+          <w:left w:val="nil"/>
+          <w:right w:val="nil"/>
+          <w:between w:val="nil"/>
+        </w:pBdr>
+        <w:rPr>
+          <w:rFonts w:ascii="Arial" w:eastAsia="Arial" w:hAnsi="Arial" w:cs="Arial"/>
+          <w:color w:val="000000"/>
+          <w:sz w:val="20"/>
+          <w:szCs w:val="20"/>
+        </w:rPr>
+      </w:pPr>
+    </w:p>
+    <w:p>
+      <w:pPr>
+        <w:pBdr>
+          <w:top w:val="nil"/>
+          <w:left w:val="nil"/>
+          <w:right w:val="nil"/>
+          <w:between w:val="nil"/>
+        </w:pBdr>
+        <w:tabs>
+          <w:tab w:val="right" w:pos="9360"/>
+        </w:tabs>
+        <w:rPr>
+          <w:rFonts w:ascii="Arial" w:eastAsia="Arial" w:hAnsi="Arial" w:cs="Arial"/>
+          <w:color w:val="000000"/>
+          <w:sz w:val="20"/>
+          <w:szCs w:val="20"/>
+        </w:rPr>
+      </w:pPr>
+      <w:r>
+        <w:rPr>
+          <w:rFonts w:ascii="Arial" w:eastAsia="Arial" w:hAnsi="Arial" w:cs="Arial"/>
+          <w:color w:val="000000"/>
+          <w:sz w:val="20"/>
+          <w:szCs w:val="20"/>
+        </w:rPr>
+        <w:t xml:space="preserve">Assisted in maintenance and enhancements of the intelligent portfolio product. Prototyped new technology that provided visibility into the service mesh by taking machine-oriented data and presenting it in a human-centric fashion. I developed this proof of concept with C#, Blazor, Docker, and Kafka. Advised the lower environment strategy and prototyping </w:t>
+      </w:r>
+      <w:r>
+        <w:rPr>
+          <w:rFonts w:ascii="Arial" w:eastAsia="Arial" w:hAnsi="Arial" w:cs="Arial"/>
+          <w:color w:val="000000"/>
+          <w:sz w:val="20"/>
+          <w:szCs w:val="20"/>
+        </w:rPr>
+        <w:t xml:space="preserve">of </w:t>
+      </w:r>
+      <w:r>
+        <w:rPr>
+          <w:rFonts w:ascii="Arial" w:eastAsia="Arial" w:hAnsi="Arial" w:cs="Arial"/>
+          <w:color w:val="000000"/>
+          <w:sz w:val="20"/>
+          <w:szCs w:val="20"/>
+        </w:rPr>
+        <w:t>new technologies to improve testing outcomes.</w:t>
+      </w:r>
+    </w:p>
+    <w:p>
+      <w:pPr>
+        <w:pBdr>
+          <w:top w:val="nil"/>
+          <w:left w:val="nil"/>
+          <w:right w:val="nil"/>
+          <w:between w:val="nil"/>
+        </w:pBdr>
+        <w:tabs>
+          <w:tab w:val="right" w:pos="9360"/>
+        </w:tabs>
+        <w:rPr>
+          <w:rFonts w:ascii="Arial" w:eastAsia="Arial" w:hAnsi="Arial" w:cs="Arial"/>
+          <w:color w:val="000000"/>
+          <w:sz w:val="20"/>
+          <w:szCs w:val="20"/>
+        </w:rPr>
+      </w:pPr>
+    </w:p>
+    <w:p>
+      <w:pPr>
+        <w:pBdr>
+          <w:top w:val="nil"/>
+          <w:left w:val="nil"/>
+          <w:right w:val="nil"/>
+          <w:between w:val="nil"/>
+        </w:pBdr>
+        <w:tabs>
+          <w:tab w:val="right" w:pos="9360"/>
+        </w:tabs>
+        <w:rPr>
+          <w:rFonts w:ascii="Arial" w:eastAsia="Arial" w:hAnsi="Arial" w:cs="Arial"/>
+          <w:b/>
+          <w:sz w:val="20"/>
+          <w:szCs w:val="20"/>
+        </w:rPr>
+      </w:pPr>
+    </w:p>
+    <w:p>
+      <w:pPr>
+        <w:pBdr>
+          <w:top w:val="nil"/>
+          <w:left w:val="nil"/>
+          <w:right w:val="nil"/>
+          <w:between w:val="nil"/>
+        </w:pBdr>
+        <w:tabs>
+          <w:tab w:val="right" w:pos="9360"/>
+        </w:tabs>
+        <w:rPr>
+          <w:rFonts w:ascii="Arial" w:eastAsia="Arial" w:hAnsi="Arial" w:cs="Arial"/>
+          <w:color w:val="000000"/>
+          <w:sz w:val="20"/>
+          <w:szCs w:val="20"/>
+          <w:highlight w:val="white"/>
+        </w:rPr>
+      </w:pPr>
+      <w:r>
+        <w:rPr>
+          <w:rFonts w:ascii="Arial" w:eastAsia="Arial" w:hAnsi="Arial" w:cs="Arial"/>
+          <w:b/>
+          <w:sz w:val="20"/>
+          <w:szCs w:val="20"/>
+        </w:rPr>
+        <w:t>Founder</w:t>
+      </w:r>
+      <w:r>
+        <w:rPr>
+          <w:rFonts w:ascii="Arial" w:eastAsia="Arial" w:hAnsi="Arial" w:cs="Arial"/>
+          <w:b/>
+          <w:sz w:val="20"/>
+          <w:szCs w:val="20"/>
+        </w:rPr>
+        <w:t xml:space="preserve"> </w:t>
+      </w:r>
+      <w:r>
+        <w:rPr>
+          <w:rFonts w:ascii="Arial" w:eastAsia="Arial" w:hAnsi="Arial" w:cs="Arial"/>
+          <w:b/>
+          <w:sz w:val="20"/>
+          <w:szCs w:val="20"/>
+        </w:rPr>
+        <w:t xml:space="preserve">| </w:t>
+      </w:r>
+      <w:r>
+        <w:rPr>
+          <w:rFonts w:ascii="Arial" w:eastAsia="Arial" w:hAnsi="Arial" w:cs="Arial"/>
+          <w:b/>
+          <w:sz w:val="20"/>
+          <w:szCs w:val="20"/>
+        </w:rPr>
+        <w:t>Possum Labs | Denver</w:t>
+      </w:r>
+      <w:r>
+        <w:rPr>
+          <w:rFonts w:ascii="Arial" w:eastAsia="Arial" w:hAnsi="Arial" w:cs="Arial"/>
+          <w:b/>
+          <w:sz w:val="20"/>
+          <w:szCs w:val="20"/>
+        </w:rPr>
+        <w:t>, CO</w:t>
+      </w:r>
+      <w:r>
+        <w:rPr>
+          <w:rFonts w:ascii="Arial" w:eastAsia="Arial" w:hAnsi="Arial" w:cs="Arial"/>
+          <w:b/>
+          <w:sz w:val="20"/>
+          <w:szCs w:val="20"/>
+        </w:rPr>
+        <w:tab/>
+      </w:r>
+      <w:r>
+        <w:rPr>
+          <w:rFonts w:ascii="Arial" w:eastAsia="Arial" w:hAnsi="Arial" w:cs="Arial"/>
+          <w:b/>
+          <w:sz w:val="20"/>
+          <w:szCs w:val="20"/>
+        </w:rPr>
+        <w:t>Jan</w:t>
+      </w:r>
+      <w:r>
+        <w:rPr>
+          <w:rFonts w:ascii="Arial" w:eastAsia="Arial" w:hAnsi="Arial" w:cs="Arial"/>
+          <w:b/>
+          <w:sz w:val="20"/>
+          <w:szCs w:val="20"/>
+        </w:rPr>
+        <w:t xml:space="preserve"> 2018</w:t>
+      </w:r>
+      <w:r>
+        <w:rPr>
+          <w:rFonts w:ascii="Arial" w:eastAsia="Arial" w:hAnsi="Arial" w:cs="Arial"/>
+          <w:b/>
+          <w:sz w:val="20"/>
+          <w:szCs w:val="20"/>
+          <w:highlight w:val="white"/>
+        </w:rPr>
+        <w:t xml:space="preserve"> – </w:t>
+      </w:r>
+      <w:r>
+        <w:rPr>
+          <w:rFonts w:ascii="Arial" w:eastAsia="Arial" w:hAnsi="Arial" w:cs="Arial"/>
+          <w:b/>
+          <w:sz w:val="20"/>
+          <w:szCs w:val="20"/>
+        </w:rPr>
+        <w:t>Apr</w:t>
+      </w:r>
+      <w:r>
+        <w:rPr>
+          <w:rFonts w:ascii="Arial" w:eastAsia="Arial" w:hAnsi="Arial" w:cs="Arial"/>
+          <w:b/>
+          <w:sz w:val="20"/>
+          <w:szCs w:val="20"/>
+        </w:rPr>
+        <w:t xml:space="preserve"> 202</w:t>
+      </w:r>
+      <w:r>
+        <w:rPr>
+          <w:rFonts w:ascii="Arial" w:eastAsia="Arial" w:hAnsi="Arial" w:cs="Arial"/>
+          <w:b/>
+          <w:sz w:val="20"/>
+          <w:szCs w:val="20"/>
+        </w:rPr>
+        <w:t>0</w:t>
+      </w:r>
+    </w:p>
+    <w:p>
+      <w:pPr>
+        <w:pBdr>
+          <w:top w:val="nil"/>
+          <w:left w:val="nil"/>
+          <w:right w:val="nil"/>
+          <w:between w:val="nil"/>
+        </w:pBdr>
+        <w:rPr>
+          <w:rFonts w:ascii="Arial" w:eastAsia="Arial" w:hAnsi="Arial" w:cs="Arial"/>
+          <w:sz w:val="20"/>
+          <w:szCs w:val="20"/>
+        </w:rPr>
+      </w:pPr>
+    </w:p>
+    <w:p>
+      <w:pPr>
+        <w:pBdr>
+          <w:top w:val="nil"/>
+          <w:left w:val="nil"/>
+          <w:right w:val="nil"/>
+          <w:between w:val="nil"/>
+        </w:pBdr>
+        <w:rPr>
+          <w:rFonts w:ascii="Arial" w:eastAsia="Arial" w:hAnsi="Arial" w:cs="Arial"/>
+          <w:sz w:val="20"/>
+          <w:szCs w:val="20"/>
+        </w:rPr>
+      </w:pPr>
+      <w:r>
+        <w:rPr>
+          <w:rFonts w:ascii="Arial" w:eastAsia="Arial" w:hAnsi="Arial" w:cs="Arial"/>
+          <w:sz w:val="20"/>
+          <w:szCs w:val="20"/>
+        </w:rPr>
+        <w:t xml:space="preserve">In 2018, the consulting company </w:t>
+      </w:r>
+      <w:r>
+        <w:rPr>
+          <w:rFonts w:ascii="Arial" w:eastAsia="Arial" w:hAnsi="Arial" w:cs="Arial"/>
+          <w:sz w:val="20"/>
+          <w:szCs w:val="20"/>
+        </w:rPr>
+        <w:t>transformed into a product company</w:t>
+      </w:r>
+      <w:r>
+        <w:rPr>
+          <w:rFonts w:ascii="Arial" w:eastAsia="Arial" w:hAnsi="Arial" w:cs="Arial"/>
+          <w:sz w:val="20"/>
+          <w:szCs w:val="20"/>
+        </w:rPr>
+        <w:t>. We then developed and built</w:t>
+      </w:r>
+      <w:r>
+        <w:rPr>
+          <w:rFonts w:ascii="Arial" w:eastAsia="Arial" w:hAnsi="Arial" w:cs="Arial"/>
+          <w:color w:val="000000"/>
+          <w:sz w:val="20"/>
+          <w:szCs w:val="20"/>
+        </w:rPr>
+        <w:t xml:space="preserve"> a user-friendly web app for organizations’ business experts to describe desired outcomes for software in customizable </w:t>
+      </w:r>
+      <w:r>
+        <w:rPr>
+          <w:rFonts w:ascii="Arial" w:eastAsia="Arial" w:hAnsi="Arial" w:cs="Arial"/>
+          <w:sz w:val="20"/>
+          <w:szCs w:val="20"/>
+        </w:rPr>
+        <w:t>domain-specific</w:t>
+      </w:r>
+      <w:r>
+        <w:rPr>
+          <w:rFonts w:ascii="Arial" w:eastAsia="Arial" w:hAnsi="Arial" w:cs="Arial"/>
+          <w:color w:val="000000"/>
+          <w:sz w:val="20"/>
+          <w:szCs w:val="20"/>
+        </w:rPr>
+        <w:t xml:space="preserve"> languages. </w:t>
+      </w:r>
+      <w:r>
+        <w:rPr>
+          <w:rFonts w:ascii="Arial" w:eastAsia="Arial" w:hAnsi="Arial" w:cs="Arial"/>
+          <w:sz w:val="20"/>
+          <w:szCs w:val="20"/>
+        </w:rPr>
+        <w:t>It</w:t>
+      </w:r>
+      <w:r>
+        <w:rPr>
+          <w:rFonts w:ascii="Arial" w:eastAsia="Arial" w:hAnsi="Arial" w:cs="Arial"/>
+          <w:sz w:val="20"/>
+          <w:szCs w:val="20"/>
+        </w:rPr>
+        <w:t xml:space="preserve"> </w:t>
+      </w:r>
+      <w:r>
+        <w:rPr>
+          <w:rFonts w:ascii="Arial" w:eastAsia="Arial" w:hAnsi="Arial" w:cs="Arial"/>
+          <w:sz w:val="20"/>
+          <w:szCs w:val="20"/>
+        </w:rPr>
+        <w:t xml:space="preserve">allowed me to develop and architect, learn how to </w:t>
+      </w:r>
+      <w:r>
+        <w:rPr>
+          <w:rFonts w:ascii="Arial" w:eastAsia="Arial" w:hAnsi="Arial" w:cs="Arial"/>
+          <w:sz w:val="20"/>
+          <w:szCs w:val="20"/>
+        </w:rPr>
+        <w:t xml:space="preserve">run a business, </w:t>
+      </w:r>
+      <w:r>
+        <w:rPr>
+          <w:rFonts w:ascii="Arial" w:eastAsia="Arial" w:hAnsi="Arial" w:cs="Arial"/>
+          <w:sz w:val="20"/>
+          <w:szCs w:val="20"/>
+        </w:rPr>
+        <w:t>build</w:t>
+      </w:r>
+      <w:r>
+        <w:rPr>
+          <w:rFonts w:ascii="Arial" w:eastAsia="Arial" w:hAnsi="Arial" w:cs="Arial"/>
+          <w:sz w:val="20"/>
+          <w:szCs w:val="20"/>
+        </w:rPr>
+        <w:t xml:space="preserve"> </w:t>
+      </w:r>
+      <w:r>
+        <w:rPr>
+          <w:rFonts w:ascii="Arial" w:eastAsia="Arial" w:hAnsi="Arial" w:cs="Arial"/>
+          <w:sz w:val="20"/>
+          <w:szCs w:val="20"/>
+        </w:rPr>
+        <w:t>&amp;</w:t>
+      </w:r>
+      <w:r>
+        <w:rPr>
+          <w:rFonts w:ascii="Arial" w:eastAsia="Arial" w:hAnsi="Arial" w:cs="Arial"/>
+          <w:sz w:val="20"/>
+          <w:szCs w:val="20"/>
+        </w:rPr>
+        <w:t xml:space="preserve"> mentor a team,</w:t>
+      </w:r>
+      <w:r>
+        <w:rPr>
+          <w:rFonts w:ascii="Arial" w:eastAsia="Arial" w:hAnsi="Arial" w:cs="Arial"/>
+          <w:sz w:val="20"/>
+          <w:szCs w:val="20"/>
+        </w:rPr>
+        <w:t xml:space="preserve"> and</w:t>
+      </w:r>
+      <w:r>
+        <w:rPr>
+          <w:rFonts w:ascii="Arial" w:eastAsia="Arial" w:hAnsi="Arial" w:cs="Arial"/>
+          <w:sz w:val="20"/>
+          <w:szCs w:val="20"/>
+        </w:rPr>
+        <w:t xml:space="preserve"> work with customers</w:t>
+      </w:r>
+      <w:r>
+        <w:rPr>
+          <w:rFonts w:ascii="Arial" w:eastAsia="Arial" w:hAnsi="Arial" w:cs="Arial"/>
+          <w:sz w:val="20"/>
+          <w:szCs w:val="20"/>
+        </w:rPr>
+        <w:t>.</w:t>
+      </w:r>
+    </w:p>
+    <w:p>
+      <w:pPr>
+        <w:pBdr>
+          <w:top w:val="nil"/>
+          <w:left w:val="nil"/>
+          <w:right w:val="nil"/>
+          <w:between w:val="nil"/>
+        </w:pBdr>
+        <w:rPr>
+          <w:rFonts w:ascii="Arial" w:eastAsia="Arial" w:hAnsi="Arial" w:cs="Arial"/>
+          <w:sz w:val="20"/>
+          <w:szCs w:val="20"/>
+        </w:rPr>
+      </w:pPr>
+    </w:p>
+    <w:p>
+      <w:pPr>
+        <w:pBdr>
+          <w:top w:val="nil"/>
+          <w:left w:val="nil"/>
+          <w:right w:val="nil"/>
+          <w:between w:val="nil"/>
+        </w:pBdr>
+        <w:rPr>
+          <w:rFonts w:ascii="Arial" w:eastAsia="Arial" w:hAnsi="Arial" w:cs="Arial"/>
+          <w:sz w:val="20"/>
+          <w:szCs w:val="20"/>
+        </w:rPr>
+      </w:pPr>
+      <w:r>
+        <w:rPr>
+          <w:rFonts w:ascii="Arial" w:eastAsia="Arial" w:hAnsi="Arial" w:cs="Arial"/>
+          <w:sz w:val="20"/>
+          <w:szCs w:val="20"/>
+        </w:rPr>
+        <w:t>The architecture, development, and deployment were created with the budget in mind. Azure was the hosting platform</w:t>
+      </w:r>
+      <w:r>
+        <w:rPr>
+          <w:rFonts w:ascii="Arial" w:eastAsia="Arial" w:hAnsi="Arial" w:cs="Arial"/>
+          <w:sz w:val="20"/>
+          <w:szCs w:val="20"/>
+        </w:rPr>
+        <w:t>,</w:t>
+      </w:r>
+      <w:r>
+        <w:rPr>
+          <w:rFonts w:ascii="Arial" w:eastAsia="Arial" w:hAnsi="Arial" w:cs="Arial"/>
+          <w:sz w:val="20"/>
+          <w:szCs w:val="20"/>
+        </w:rPr>
+        <w:t xml:space="preserve"> </w:t>
+      </w:r>
+      <w:r>
+        <w:rPr>
+          <w:rFonts w:ascii="Arial" w:eastAsia="Arial" w:hAnsi="Arial" w:cs="Arial"/>
+          <w:sz w:val="20"/>
+          <w:szCs w:val="20"/>
+        </w:rPr>
+        <w:t>and</w:t>
+      </w:r>
+      <w:r>
+        <w:rPr>
+          <w:rFonts w:ascii="Arial" w:eastAsia="Arial" w:hAnsi="Arial" w:cs="Arial"/>
+          <w:sz w:val="20"/>
+          <w:szCs w:val="20"/>
+        </w:rPr>
+        <w:t xml:space="preserve"> </w:t>
+      </w:r>
+      <w:r>
+        <w:rPr>
+          <w:rFonts w:ascii="Arial" w:eastAsia="Arial" w:hAnsi="Arial" w:cs="Arial"/>
+          <w:sz w:val="20"/>
+          <w:szCs w:val="20"/>
+        </w:rPr>
+        <w:t>a Kubernetes hosting strategy was chosen to allow future flexibility</w:t>
+      </w:r>
+      <w:r>
+        <w:rPr>
+          <w:rFonts w:ascii="Arial" w:eastAsia="Arial" w:hAnsi="Arial" w:cs="Arial"/>
+          <w:sz w:val="20"/>
+          <w:szCs w:val="20"/>
+        </w:rPr>
+        <w:t>. Every operation in Azure was scripted to allow for environments to be provisioned as needed. The backend was written in C#</w:t>
+      </w:r>
+      <w:r>
+        <w:rPr>
+          <w:rFonts w:ascii="Arial" w:eastAsia="Arial" w:hAnsi="Arial" w:cs="Arial"/>
+          <w:sz w:val="20"/>
+          <w:szCs w:val="20"/>
+        </w:rPr>
+        <w:t>, focusing</w:t>
+      </w:r>
+      <w:r>
+        <w:rPr>
+          <w:rFonts w:ascii="Arial" w:eastAsia="Arial" w:hAnsi="Arial" w:cs="Arial"/>
+          <w:sz w:val="20"/>
+          <w:szCs w:val="20"/>
+        </w:rPr>
+        <w:t xml:space="preserve"> on clear and consistent naming to help onboard </w:t>
+      </w:r>
+      <w:r>
+        <w:rPr>
+          <w:rFonts w:ascii="Arial" w:eastAsia="Arial" w:hAnsi="Arial" w:cs="Arial"/>
+          <w:sz w:val="20"/>
+          <w:szCs w:val="20"/>
+        </w:rPr>
+        <w:t xml:space="preserve">engineers. Frontend development </w:t>
+      </w:r>
+      <w:r>
+        <w:rPr>
+          <w:rFonts w:ascii="Arial" w:eastAsia="Arial" w:hAnsi="Arial" w:cs="Arial"/>
+          <w:sz w:val="20"/>
+          <w:szCs w:val="20"/>
+        </w:rPr>
+        <w:t>leverage</w:t>
+      </w:r>
+      <w:r>
+        <w:rPr>
+          <w:rFonts w:ascii="Arial" w:eastAsia="Arial" w:hAnsi="Arial" w:cs="Arial"/>
+          <w:sz w:val="20"/>
+          <w:szCs w:val="20"/>
+        </w:rPr>
+        <w:t>d</w:t>
+      </w:r>
+      <w:r>
+        <w:rPr>
+          <w:rFonts w:ascii="Arial" w:eastAsia="Arial" w:hAnsi="Arial" w:cs="Arial"/>
+          <w:sz w:val="20"/>
+          <w:szCs w:val="20"/>
+        </w:rPr>
+        <w:t xml:space="preserve"> code generation. The </w:t>
+      </w:r>
+      <w:r>
+        <w:rPr>
+          <w:rFonts w:ascii="Arial" w:eastAsia="Arial" w:hAnsi="Arial" w:cs="Arial"/>
+          <w:sz w:val="20"/>
+          <w:szCs w:val="20"/>
+        </w:rPr>
+        <w:t>frontend</w:t>
+      </w:r>
+      <w:r>
+        <w:rPr>
+          <w:rFonts w:ascii="Arial" w:eastAsia="Arial" w:hAnsi="Arial" w:cs="Arial"/>
+          <w:sz w:val="20"/>
+          <w:szCs w:val="20"/>
+        </w:rPr>
+        <w:t xml:space="preserve"> was written in </w:t>
+      </w:r>
+      <w:r>
+        <w:rPr>
+          <w:rFonts w:ascii="Arial" w:eastAsia="Arial" w:hAnsi="Arial" w:cs="Arial"/>
+          <w:sz w:val="20"/>
+          <w:szCs w:val="20"/>
+        </w:rPr>
+        <w:t>A</w:t>
+      </w:r>
+      <w:r>
+        <w:rPr>
+          <w:rFonts w:ascii="Arial" w:eastAsia="Arial" w:hAnsi="Arial" w:cs="Arial"/>
+          <w:sz w:val="20"/>
+          <w:szCs w:val="20"/>
+        </w:rPr>
+        <w:t>ngular</w:t>
+      </w:r>
+      <w:r>
+        <w:rPr>
+          <w:rFonts w:ascii="Arial" w:eastAsia="Arial" w:hAnsi="Arial" w:cs="Arial"/>
+          <w:sz w:val="20"/>
+          <w:szCs w:val="20"/>
+        </w:rPr>
+        <w:t>; despite being</w:t>
+      </w:r>
+      <w:r>
+        <w:rPr>
+          <w:rFonts w:ascii="Arial" w:eastAsia="Arial" w:hAnsi="Arial" w:cs="Arial"/>
+          <w:sz w:val="20"/>
+          <w:szCs w:val="20"/>
+        </w:rPr>
+        <w:t xml:space="preserve"> a </w:t>
+      </w:r>
+      <w:r>
+        <w:rPr>
+          <w:rFonts w:ascii="Arial" w:eastAsia="Arial" w:hAnsi="Arial" w:cs="Arial"/>
+          <w:sz w:val="20"/>
+          <w:szCs w:val="20"/>
+        </w:rPr>
+        <w:t>heavy-weight</w:t>
+      </w:r>
+      <w:r>
+        <w:rPr>
+          <w:rFonts w:ascii="Arial" w:eastAsia="Arial" w:hAnsi="Arial" w:cs="Arial"/>
+          <w:sz w:val="20"/>
+          <w:szCs w:val="20"/>
+        </w:rPr>
+        <w:t xml:space="preserve"> solution</w:t>
+      </w:r>
+      <w:r>
+        <w:rPr>
+          <w:rFonts w:ascii="Arial" w:eastAsia="Arial" w:hAnsi="Arial" w:cs="Arial"/>
+          <w:sz w:val="20"/>
+          <w:szCs w:val="20"/>
+        </w:rPr>
+        <w:t>,</w:t>
+      </w:r>
+      <w:r>
+        <w:rPr>
+          <w:rFonts w:ascii="Arial" w:eastAsia="Arial" w:hAnsi="Arial" w:cs="Arial"/>
+          <w:sz w:val="20"/>
+          <w:szCs w:val="20"/>
+        </w:rPr>
+        <w:t xml:space="preserve"> it allowed for small components to be worked on by junior </w:t>
+      </w:r>
+      <w:r>
+        <w:rPr>
+          <w:rFonts w:ascii="Arial" w:eastAsia="Arial" w:hAnsi="Arial" w:cs="Arial"/>
+          <w:sz w:val="20"/>
+          <w:szCs w:val="20"/>
+        </w:rPr>
+        <w:t>engineers</w:t>
+      </w:r>
+      <w:r>
+        <w:rPr>
+          <w:rFonts w:ascii="Arial" w:eastAsia="Arial" w:hAnsi="Arial" w:cs="Arial"/>
+          <w:sz w:val="20"/>
+          <w:szCs w:val="20"/>
+        </w:rPr>
+        <w:t xml:space="preserve">. Although Angular is complex, making changes to a single component is not intimidating and allows junior resources to build proficiency and confidence, peeling back the layers as they </w:t>
+      </w:r>
+      <w:r>
+        <w:rPr>
+          <w:rFonts w:ascii="Arial" w:eastAsia="Arial" w:hAnsi="Arial" w:cs="Arial"/>
+          <w:sz w:val="20"/>
+          <w:szCs w:val="20"/>
+        </w:rPr>
+        <w:t>advance</w:t>
+      </w:r>
+      <w:r>
+        <w:rPr>
+          <w:rFonts w:ascii="Arial" w:eastAsia="Arial" w:hAnsi="Arial" w:cs="Arial"/>
+          <w:sz w:val="20"/>
+          <w:szCs w:val="20"/>
+        </w:rPr>
+        <w:t xml:space="preserve">. </w:t>
+      </w:r>
+    </w:p>
+    <w:p>
+      <w:pPr>
+        <w:pBdr>
+          <w:top w:val="nil"/>
+          <w:left w:val="nil"/>
+          <w:right w:val="nil"/>
+          <w:between w:val="nil"/>
+        </w:pBdr>
+        <w:rPr>
+          <w:rFonts w:ascii="Arial" w:eastAsia="Arial" w:hAnsi="Arial" w:cs="Arial"/>
+          <w:color w:val="000000"/>
+          <w:sz w:val="20"/>
+          <w:szCs w:val="20"/>
+        </w:rPr>
+      </w:pPr>
+    </w:p>
+    <w:p>
+      <w:pPr>
+        <w:pBdr>
+          <w:top w:val="nil"/>
+          <w:left w:val="nil"/>
+          <w:right w:val="nil"/>
+          <w:between w:val="nil"/>
+        </w:pBdr>
+        <w:tabs>
+          <w:tab w:val="right" w:pos="9360"/>
+        </w:tabs>
+        <w:rPr>
+          <w:rFonts w:ascii="Arial" w:eastAsia="Arial" w:hAnsi="Arial" w:cs="Arial"/>
           <w:color w:val="000000"/>
           <w:sz w:val="20"/>
           <w:szCs w:val="20"/>
@@ -2170,7 +2435,25 @@
           <w:sz w:val="20"/>
           <w:szCs w:val="20"/>
         </w:rPr>
-        <w:t xml:space="preserve"> to provide technical support and mentor QA members post-contract.</w:t>
+        <w:t xml:space="preserve"> to provide technical support and mentor QA </w:t>
+      </w:r>
+      <w:proofErr w:type="gramStart"/>
+      <w:r>
+        <w:rPr>
+          <w:rFonts w:ascii="Arial" w:eastAsia="Arial" w:hAnsi="Arial" w:cs="Arial"/>
+          <w:sz w:val="20"/>
+          <w:szCs w:val="20"/>
+        </w:rPr>
+        <w:t>members</w:t>
+      </w:r>
+      <w:proofErr w:type="gramEnd"/>
+      <w:r>
+        <w:rPr>
+          <w:rFonts w:ascii="Arial" w:eastAsia="Arial" w:hAnsi="Arial" w:cs="Arial"/>
+          <w:sz w:val="20"/>
+          <w:szCs w:val="20"/>
+        </w:rPr>
+        <w:t xml:space="preserve"> post-contract.</w:t>
       </w:r>
     </w:p>
     <w:p>
@@ -2593,6 +2876,7 @@
           <w:szCs w:val="20"/>
           <w:highlight w:val="white"/>
         </w:rPr>
+        <w:lastRenderedPageBreak/>
         <w:t>• The</w:t>
       </w:r>
       <w:r>
@@ -2754,14 +3038,25 @@
         </w:rPr>
         <w:t xml:space="preserve">million concurrent users watching content. </w:t>
       </w:r>
-      <w:r>
-        <w:rPr>
-          <w:rFonts w:ascii="Arial" w:eastAsia="Arial" w:hAnsi="Arial" w:cs="Arial"/>
-          <w:color w:val="000000"/>
-          <w:sz w:val="20"/>
-          <w:szCs w:val="20"/>
-        </w:rPr>
-        <w:t xml:space="preserve">This framework, built using Node, Angular 2, and TypeScript, </w:t>
+      <w:proofErr w:type="gramStart"/>
+      <w:r>
+        <w:rPr>
+          <w:rFonts w:ascii="Arial" w:eastAsia="Arial" w:hAnsi="Arial" w:cs="Arial"/>
+          <w:color w:val="000000"/>
+          <w:sz w:val="20"/>
+          <w:szCs w:val="20"/>
+        </w:rPr>
+        <w:t>This framework,</w:t>
+      </w:r>
+      <w:proofErr w:type="gramEnd"/>
+      <w:r>
+        <w:rPr>
+          <w:rFonts w:ascii="Arial" w:eastAsia="Arial" w:hAnsi="Arial" w:cs="Arial"/>
+          <w:color w:val="000000"/>
+          <w:sz w:val="20"/>
+          <w:szCs w:val="20"/>
+        </w:rPr>
+        <w:t xml:space="preserve"> built using Node, Angular 2, and TypeScript, </w:t>
       </w:r>
       <w:r>
         <w:rPr>
@@ -3076,17 +3371,7 @@
           <w:szCs w:val="20"/>
           <w:highlight w:val="white"/>
         </w:rPr>
-        <w:t xml:space="preserve">goal. The completed </w:t>
-      </w:r>
-      <w:r>
-        <w:rPr>
-          <w:rFonts w:ascii="Arial" w:eastAsia="Arial" w:hAnsi="Arial" w:cs="Arial"/>
-          <w:sz w:val="20"/>
-          <w:szCs w:val="20"/>
-          <w:highlight w:val="white"/>
-        </w:rPr>
-        <w:lastRenderedPageBreak/>
-        <w:t xml:space="preserve">project </w:t>
+        <w:t xml:space="preserve">goal. The completed project </w:t>
       </w:r>
       <w:r>
         <w:rPr>
@@ -4591,6 +4876,7 @@
                 <w:sz w:val="20"/>
                 <w:szCs w:val="20"/>
               </w:rPr>
+              <w:lastRenderedPageBreak/>
               <w:t>ASP</w:t>
             </w:r>
             <w:r>
@@ -5031,8 +5317,8 @@
           <w:szCs w:val="20"/>
         </w:rPr>
         <w:sectPr>
-          <w:headerReference w:type="default" r:id="rId10"/>
-          <w:headerReference w:type="first" r:id="rId11"/>
+          <w:headerReference w:type="default" r:id="rId9"/>
+          <w:headerReference w:type="first" r:id="rId10"/>
           <w:pgSz w:w="12240" w:h="15840"/>
           <w:pgMar w:top="1440" w:right="1440" w:bottom="720" w:left="1440" w:header="630" w:footer="720" w:gutter="0"/>
           <w:pgNumType w:start="1"/>
@@ -5584,7 +5870,6 @@
           <w:sz w:val="20"/>
           <w:szCs w:val="20"/>
         </w:rPr>
-        <w:lastRenderedPageBreak/>
         <w:t>IOC</w:t>
       </w:r>
     </w:p>
@@ -6274,6 +6559,7 @@
           <w:szCs w:val="20"/>
         </w:rPr>
       </w:pPr>
+      <w:proofErr w:type="spellStart"/>
       <w:r>
         <w:rPr>
           <w:rFonts w:ascii="Arial" w:eastAsia="Arial" w:hAnsi="Arial" w:cs="Arial"/>
@@ -6283,6 +6569,7 @@
         </w:rPr>
         <w:t>WireMock</w:t>
       </w:r>
+      <w:proofErr w:type="spellEnd"/>
     </w:p>
     <w:p>
       <w:pPr>
@@ -7919,7 +8206,6 @@
   <w:style w:type="character" w:default="1" w:styleId="DefaultParagraphFont">
     <w:name w:val="Default Paragraph Font"/>
     <w:uiPriority w:val="1"/>
-    <w:semiHidden/>
     <w:unhideWhenUsed/>
   </w:style>
   <w:style w:type="table" w:default="1" w:styleId="TableNormal">
@@ -8488,28 +8774,28 @@
 </file>
 
 <file path=customXml/item1.xml><?xml version="1.0" encoding="utf-8"?>
+<b:Sources xmlns:b="http://schemas.openxmlformats.org/officeDocument/2006/bibliography" xmlns="http://schemas.openxmlformats.org/officeDocument/2006/bibliography" SelectedStyle="\APASixthEditionOfficeOnline.xsl" StyleName="APA" Version="6"/>
+</file>
+
+<file path=customXml/item2.xml><?xml version="1.0" encoding="utf-8"?>
 <go:gDocsCustomXmlDataStorage xmlns:go="http://customooxmlschemas.google.com/" xmlns:r="http://schemas.openxmlformats.org/officeDocument/2006/relationships">
   <go:docsCustomData xmlns:go="http://customooxmlschemas.google.com/" roundtripDataSignature="AMtx7miMhC1YLhKSRHFicWIjG58lmXEHYA==">AMUW2mWPZZNbIEmc4e3sdlXQYh7PNdm/iS9juSUUGtm8gs/NLixs86kQyt7Cpc2IF3jikSZ8/0IiAC7oORVYQ7cYEP7rvUwqZCVLFjzrvH2X0ACMZOanApHqoEpKaZbT5qkfxooSYNufO/pSZ3IRRrIeqYf8SCC69JFOBkc/4CndazVYv3ocOh3mWGBJSAX4r64ymNXgUm0bJThZV68mn19c0h9yOO+WTrPG4Vrb2iR4javuKKYxbF/wzPSFBngyP8MDCPQpEHFa15gMOU/SFao1ZfzzZYzRY/U4gvNQnAY7wyMnmI7o3PA=</go:docsCustomData>
 </go:gDocsCustomXmlDataStorage>
 </file>
 
-<file path=customXml/item2.xml><?xml version="1.0" encoding="utf-8"?>
-<b:Sources xmlns:b="http://schemas.openxmlformats.org/officeDocument/2006/bibliography" xmlns="http://schemas.openxmlformats.org/officeDocument/2006/bibliography" SelectedStyle="\APASixthEditionOfficeOnline.xsl" StyleName="APA" Version="6"/>
+<file path=customXml/itemProps1.xml><?xml version="1.0" encoding="utf-8"?>
+<ds:datastoreItem xmlns:ds="http://schemas.openxmlformats.org/officeDocument/2006/customXml" ds:itemID="{A9EBA0DE-A728-4A86-9644-5131A74A113F}">
+  <ds:schemaRefs>
+    <ds:schemaRef ds:uri="http://schemas.openxmlformats.org/officeDocument/2006/bibliography"/>
+  </ds:schemaRefs>
+</ds:datastoreItem>
 </file>
 
-<file path=customXml/itemProps1.xml><?xml version="1.0" encoding="utf-8"?>
+<file path=customXml/itemProps2.xml><?xml version="1.0" encoding="utf-8"?>
 <ds:datastoreItem xmlns:ds="http://schemas.openxmlformats.org/officeDocument/2006/customXml" ds:itemID="{11111111-1234-1234-1234-123412341234}">
   <ds:schemaRefs>
     <ds:schemaRef ds:uri="http://customooxmlschemas.google.com/"/>
     <ds:schemaRef ds:uri="http://schemas.openxmlformats.org/officeDocument/2006/relationships"/>
   </ds:schemaRefs>
 </ds:datastoreItem>
-</file>
-
-<file path=customXml/itemProps2.xml><?xml version="1.0" encoding="utf-8"?>
-<ds:datastoreItem xmlns:ds="http://schemas.openxmlformats.org/officeDocument/2006/customXml" ds:itemID="{A9EBA0DE-A728-4A86-9644-5131A74A113F}">
-  <ds:schemaRefs>
-    <ds:schemaRef ds:uri="http://schemas.openxmlformats.org/officeDocument/2006/bibliography"/>
-  </ds:schemaRefs>
-</ds:datastoreItem>
 </file>
</xml_diff>